<commit_message>
Implemented my first classes (driver, request, offer, ...)
</commit_message>
<xml_diff>
--- a/exercise and report/Notes Phase 2.docx
+++ b/exercise and report/Notes Phase 2.docx
@@ -591,8 +591,1318 @@
         <w:rPr>
           <w:lang w:val="en-US"/>
         </w:rPr>
-        <w:t xml:space="preserve">? </w:t>
-      </w:r>
+        <w:t>?</w:t>
+      </w:r>
+      <w:r>
+        <w:rPr>
+          <w:lang w:val="en-US"/>
+        </w:rPr>
+        <w:t xml:space="preserve"> Microsoft</w:t>
+      </w:r>
+      <w:r>
+        <w:rPr>
+          <w:lang w:val="en-US"/>
+        </w:rPr>
+        <w:t xml:space="preserve"> </w:t>
+      </w:r>
+      <w:r>
+        <w:rPr>
+          <w:lang w:val="en-US"/>
+        </w:rPr>
+        <w:t>Teams? Sending Files?</w:t>
+      </w:r>
+    </w:p>
+    <w:p>
+      <w:pPr>
+        <w:pStyle w:val="ListParagraph"/>
+        <w:numPr>
+          <w:ilvl w:val="1"/>
+          <w:numId w:val="2"/>
+        </w:numPr>
+        <w:rPr>
+          <w:lang w:val="en-US"/>
+        </w:rPr>
+      </w:pPr>
+      <w:r>
+        <w:rPr>
+          <w:lang w:val="en-US"/>
+        </w:rPr>
+        <w:t xml:space="preserve">I will also upload out old project. </w:t>
+      </w:r>
+    </w:p>
+    <w:p>
+      <w:pPr>
+        <w:pStyle w:val="ListParagraph"/>
+        <w:numPr>
+          <w:ilvl w:val="0"/>
+          <w:numId w:val="2"/>
+        </w:numPr>
+        <w:rPr>
+          <w:lang w:val="en-US"/>
+        </w:rPr>
+      </w:pPr>
+      <w:r>
+        <w:rPr>
+          <w:lang w:val="en-US"/>
+        </w:rPr>
+        <w:t>Tasks</w:t>
+      </w:r>
+    </w:p>
+    <w:p>
+      <w:pPr>
+        <w:pStyle w:val="ListParagraph"/>
+        <w:numPr>
+          <w:ilvl w:val="1"/>
+          <w:numId w:val="2"/>
+        </w:numPr>
+        <w:rPr>
+          <w:lang w:val="en-US"/>
+        </w:rPr>
+      </w:pPr>
+      <w:r>
+        <w:rPr>
+          <w:lang w:val="en-US"/>
+        </w:rPr>
+        <w:t>Lubaba</w:t>
+      </w:r>
+      <w:r>
+        <w:rPr>
+          <w:lang w:val="en-US"/>
+        </w:rPr>
+        <w:t xml:space="preserve"> (Person C)</w:t>
+      </w:r>
+    </w:p>
+    <w:p>
+      <w:pPr>
+        <w:numPr>
+          <w:ilvl w:val="2"/>
+          <w:numId w:val="2"/>
+        </w:numPr>
+        <w:spacing w:before="100" w:beforeAutospacing="1" w:after="100" w:afterAutospacing="1" w:line="240" w:lineRule="auto"/>
+        <w:rPr>
+          <w:rFonts w:ascii="Segoe UI" w:eastAsia="Times New Roman" w:hAnsi="Segoe UI" w:cs="Segoe UI"/>
+          <w:kern w:val="0"/>
+          <w:sz w:val="24"/>
+          <w:szCs w:val="24"/>
+          <w:lang w:val="en-US"/>
+          <w14:ligatures w14:val="none"/>
+        </w:rPr>
+      </w:pPr>
+      <w:r>
+        <w:rPr>
+          <w:rFonts w:ascii="Segoe UI" w:eastAsia="Times New Roman" w:hAnsi="Segoe UI" w:cs="Segoe UI"/>
+          <w:kern w:val="0"/>
+          <w:sz w:val="24"/>
+          <w:szCs w:val="24"/>
+          <w:lang w:val="en-US"/>
+          <w14:ligatures w14:val="none"/>
+        </w:rPr>
+        <w:t>Implement:</w:t>
+      </w:r>
+    </w:p>
+    <w:p>
+      <w:pPr>
+        <w:numPr>
+          <w:ilvl w:val="3"/>
+          <w:numId w:val="2"/>
+        </w:numPr>
+        <w:spacing w:before="100" w:beforeAutospacing="1" w:after="100" w:afterAutospacing="1" w:line="240" w:lineRule="auto"/>
+        <w:rPr>
+          <w:rFonts w:ascii="Segoe UI" w:eastAsia="Times New Roman" w:hAnsi="Segoe UI" w:cs="Segoe UI"/>
+          <w:kern w:val="0"/>
+          <w:sz w:val="24"/>
+          <w:szCs w:val="24"/>
+          <w:lang w:val="en-US"/>
+          <w14:ligatures w14:val="none"/>
+        </w:rPr>
+      </w:pPr>
+      <w:proofErr w:type="spellStart"/>
+      <w:r>
+        <w:rPr>
+          <w:rFonts w:ascii="Segoe UI" w:eastAsia="Times New Roman" w:hAnsi="Segoe UI" w:cs="Segoe UI"/>
+          <w:kern w:val="0"/>
+          <w:sz w:val="24"/>
+          <w:szCs w:val="24"/>
+          <w:lang w:val="en-US"/>
+          <w14:ligatures w14:val="none"/>
+        </w:rPr>
+        <w:t>DeliverySimulation</w:t>
+      </w:r>
+      <w:proofErr w:type="spellEnd"/>
+      <w:r>
+        <w:rPr>
+          <w:rFonts w:ascii="Segoe UI" w:eastAsia="Times New Roman" w:hAnsi="Segoe UI" w:cs="Segoe UI"/>
+          <w:kern w:val="0"/>
+          <w:sz w:val="24"/>
+          <w:szCs w:val="24"/>
+          <w:lang w:val="en-US"/>
+          <w14:ligatures w14:val="none"/>
+        </w:rPr>
+        <w:t>:</w:t>
+      </w:r>
+    </w:p>
+    <w:p>
+      <w:pPr>
+        <w:numPr>
+          <w:ilvl w:val="4"/>
+          <w:numId w:val="2"/>
+        </w:numPr>
+        <w:spacing w:before="100" w:beforeAutospacing="1" w:after="100" w:afterAutospacing="1" w:line="240" w:lineRule="auto"/>
+        <w:rPr>
+          <w:rFonts w:ascii="Segoe UI" w:eastAsia="Times New Roman" w:hAnsi="Segoe UI" w:cs="Segoe UI"/>
+          <w:kern w:val="0"/>
+          <w:sz w:val="24"/>
+          <w:szCs w:val="24"/>
+          <w:lang w:val="en-US"/>
+          <w14:ligatures w14:val="none"/>
+        </w:rPr>
+      </w:pPr>
+      <w:r>
+        <w:rPr>
+          <w:rFonts w:ascii="Segoe UI" w:eastAsia="Times New Roman" w:hAnsi="Segoe UI" w:cs="Segoe UI"/>
+          <w:kern w:val="0"/>
+          <w:sz w:val="24"/>
+          <w:szCs w:val="24"/>
+          <w:lang w:val="en-US"/>
+          <w14:ligatures w14:val="none"/>
+        </w:rPr>
+        <w:t>tick() with all 8 steps from the spec.</w:t>
+      </w:r>
+    </w:p>
+    <w:p>
+      <w:pPr>
+        <w:numPr>
+          <w:ilvl w:val="4"/>
+          <w:numId w:val="2"/>
+        </w:numPr>
+        <w:spacing w:before="100" w:beforeAutospacing="1" w:after="100" w:afterAutospacing="1" w:line="240" w:lineRule="auto"/>
+        <w:rPr>
+          <w:rFonts w:ascii="Segoe UI" w:eastAsia="Times New Roman" w:hAnsi="Segoe UI" w:cs="Segoe UI"/>
+          <w:kern w:val="0"/>
+          <w:sz w:val="24"/>
+          <w:szCs w:val="24"/>
+          <w:lang w:val="en-US"/>
+          <w14:ligatures w14:val="none"/>
+        </w:rPr>
+      </w:pPr>
+      <w:proofErr w:type="spellStart"/>
+      <w:r>
+        <w:rPr>
+          <w:rFonts w:ascii="Segoe UI" w:eastAsia="Times New Roman" w:hAnsi="Segoe UI" w:cs="Segoe UI"/>
+          <w:kern w:val="0"/>
+          <w:sz w:val="24"/>
+          <w:szCs w:val="24"/>
+          <w:lang w:val="en-US"/>
+          <w14:ligatures w14:val="none"/>
+        </w:rPr>
+        <w:t>get_snapshot</w:t>
+      </w:r>
+      <w:proofErr w:type="spellEnd"/>
+      <w:r>
+        <w:rPr>
+          <w:rFonts w:ascii="Segoe UI" w:eastAsia="Times New Roman" w:hAnsi="Segoe UI" w:cs="Segoe UI"/>
+          <w:kern w:val="0"/>
+          <w:sz w:val="24"/>
+          <w:szCs w:val="24"/>
+          <w:lang w:val="en-US"/>
+          <w14:ligatures w14:val="none"/>
+        </w:rPr>
+        <w:t>() for the GUI adapter.</w:t>
+      </w:r>
+    </w:p>
+    <w:p>
+      <w:pPr>
+        <w:numPr>
+          <w:ilvl w:val="3"/>
+          <w:numId w:val="2"/>
+        </w:numPr>
+        <w:spacing w:before="100" w:beforeAutospacing="1" w:after="100" w:afterAutospacing="1" w:line="240" w:lineRule="auto"/>
+        <w:rPr>
+          <w:rFonts w:ascii="Segoe UI" w:eastAsia="Times New Roman" w:hAnsi="Segoe UI" w:cs="Segoe UI"/>
+          <w:kern w:val="0"/>
+          <w:sz w:val="24"/>
+          <w:szCs w:val="24"/>
+          <w:lang w:val="en-US"/>
+          <w14:ligatures w14:val="none"/>
+        </w:rPr>
+      </w:pPr>
+      <w:r>
+        <w:rPr>
+          <w:rFonts w:ascii="Segoe UI" w:eastAsia="Times New Roman" w:hAnsi="Segoe UI" w:cs="Segoe UI"/>
+          <w:kern w:val="0"/>
+          <w:sz w:val="24"/>
+          <w:szCs w:val="24"/>
+          <w:lang w:val="en-US"/>
+          <w14:ligatures w14:val="none"/>
+        </w:rPr>
+        <w:t>Adapter module:</w:t>
+      </w:r>
+    </w:p>
+    <w:p>
+      <w:pPr>
+        <w:numPr>
+          <w:ilvl w:val="4"/>
+          <w:numId w:val="2"/>
+        </w:numPr>
+        <w:spacing w:before="100" w:beforeAutospacing="1" w:after="100" w:afterAutospacing="1" w:line="240" w:lineRule="auto"/>
+        <w:rPr>
+          <w:rFonts w:ascii="Segoe UI" w:eastAsia="Times New Roman" w:hAnsi="Segoe UI" w:cs="Segoe UI"/>
+          <w:kern w:val="0"/>
+          <w:sz w:val="24"/>
+          <w:szCs w:val="24"/>
+          <w:lang w:val="en-US"/>
+          <w14:ligatures w14:val="none"/>
+        </w:rPr>
+      </w:pPr>
+      <w:proofErr w:type="spellStart"/>
+      <w:r>
+        <w:rPr>
+          <w:rFonts w:ascii="Segoe UI" w:eastAsia="Times New Roman" w:hAnsi="Segoe UI" w:cs="Segoe UI"/>
+          <w:kern w:val="0"/>
+          <w:sz w:val="24"/>
+          <w:szCs w:val="24"/>
+          <w:lang w:val="en-US"/>
+          <w14:ligatures w14:val="none"/>
+        </w:rPr>
+        <w:t>init_simulation</w:t>
+      </w:r>
+      <w:proofErr w:type="spellEnd"/>
+      <w:r>
+        <w:rPr>
+          <w:rFonts w:ascii="Segoe UI" w:eastAsia="Times New Roman" w:hAnsi="Segoe UI" w:cs="Segoe UI"/>
+          <w:kern w:val="0"/>
+          <w:sz w:val="24"/>
+          <w:szCs w:val="24"/>
+          <w:lang w:val="en-US"/>
+          <w14:ligatures w14:val="none"/>
+        </w:rPr>
+        <w:t>(...)</w:t>
+      </w:r>
+    </w:p>
+    <w:p>
+      <w:pPr>
+        <w:numPr>
+          <w:ilvl w:val="4"/>
+          <w:numId w:val="2"/>
+        </w:numPr>
+        <w:spacing w:before="100" w:beforeAutospacing="1" w:after="100" w:afterAutospacing="1" w:line="240" w:lineRule="auto"/>
+        <w:rPr>
+          <w:rFonts w:ascii="Segoe UI" w:eastAsia="Times New Roman" w:hAnsi="Segoe UI" w:cs="Segoe UI"/>
+          <w:kern w:val="0"/>
+          <w:sz w:val="24"/>
+          <w:szCs w:val="24"/>
+          <w:lang w:val="en-US"/>
+          <w14:ligatures w14:val="none"/>
+        </w:rPr>
+      </w:pPr>
+      <w:proofErr w:type="spellStart"/>
+      <w:r>
+        <w:rPr>
+          <w:rFonts w:ascii="Segoe UI" w:eastAsia="Times New Roman" w:hAnsi="Segoe UI" w:cs="Segoe UI"/>
+          <w:kern w:val="0"/>
+          <w:sz w:val="24"/>
+          <w:szCs w:val="24"/>
+          <w:lang w:val="en-US"/>
+          <w14:ligatures w14:val="none"/>
+        </w:rPr>
+        <w:t>step_simulation</w:t>
+      </w:r>
+      <w:proofErr w:type="spellEnd"/>
+      <w:r>
+        <w:rPr>
+          <w:rFonts w:ascii="Segoe UI" w:eastAsia="Times New Roman" w:hAnsi="Segoe UI" w:cs="Segoe UI"/>
+          <w:kern w:val="0"/>
+          <w:sz w:val="24"/>
+          <w:szCs w:val="24"/>
+          <w:lang w:val="en-US"/>
+          <w14:ligatures w14:val="none"/>
+        </w:rPr>
+        <w:t xml:space="preserve">() -&gt; (time, metrics </w:t>
+      </w:r>
+      <w:proofErr w:type="spellStart"/>
+      <w:r>
+        <w:rPr>
+          <w:rFonts w:ascii="Segoe UI" w:eastAsia="Times New Roman" w:hAnsi="Segoe UI" w:cs="Segoe UI"/>
+          <w:kern w:val="0"/>
+          <w:sz w:val="24"/>
+          <w:szCs w:val="24"/>
+          <w:lang w:val="en-US"/>
+          <w14:ligatures w14:val="none"/>
+        </w:rPr>
+        <w:t>dict</w:t>
+      </w:r>
+      <w:proofErr w:type="spellEnd"/>
+      <w:r>
+        <w:rPr>
+          <w:rFonts w:ascii="Segoe UI" w:eastAsia="Times New Roman" w:hAnsi="Segoe UI" w:cs="Segoe UI"/>
+          <w:kern w:val="0"/>
+          <w:sz w:val="24"/>
+          <w:szCs w:val="24"/>
+          <w:lang w:val="en-US"/>
+          <w14:ligatures w14:val="none"/>
+        </w:rPr>
+        <w:t>)</w:t>
+      </w:r>
+    </w:p>
+    <w:p>
+      <w:pPr>
+        <w:numPr>
+          <w:ilvl w:val="4"/>
+          <w:numId w:val="2"/>
+        </w:numPr>
+        <w:spacing w:before="100" w:beforeAutospacing="1" w:after="100" w:afterAutospacing="1" w:line="240" w:lineRule="auto"/>
+        <w:rPr>
+          <w:rFonts w:ascii="Segoe UI" w:eastAsia="Times New Roman" w:hAnsi="Segoe UI" w:cs="Segoe UI"/>
+          <w:kern w:val="0"/>
+          <w:sz w:val="24"/>
+          <w:szCs w:val="24"/>
+          <w:lang w:val="en-US"/>
+          <w14:ligatures w14:val="none"/>
+        </w:rPr>
+      </w:pPr>
+      <w:proofErr w:type="spellStart"/>
+      <w:r>
+        <w:rPr>
+          <w:rFonts w:ascii="Segoe UI" w:eastAsia="Times New Roman" w:hAnsi="Segoe UI" w:cs="Segoe UI"/>
+          <w:kern w:val="0"/>
+          <w:sz w:val="24"/>
+          <w:szCs w:val="24"/>
+          <w:lang w:val="en-US"/>
+          <w14:ligatures w14:val="none"/>
+        </w:rPr>
+        <w:t>get_plot_data</w:t>
+      </w:r>
+      <w:proofErr w:type="spellEnd"/>
+      <w:r>
+        <w:rPr>
+          <w:rFonts w:ascii="Segoe UI" w:eastAsia="Times New Roman" w:hAnsi="Segoe UI" w:cs="Segoe UI"/>
+          <w:kern w:val="0"/>
+          <w:sz w:val="24"/>
+          <w:szCs w:val="24"/>
+          <w:lang w:val="en-US"/>
+          <w14:ligatures w14:val="none"/>
+        </w:rPr>
+        <w:t>()</w:t>
+      </w:r>
+    </w:p>
+    <w:p>
+      <w:pPr>
+        <w:numPr>
+          <w:ilvl w:val="3"/>
+          <w:numId w:val="2"/>
+        </w:numPr>
+        <w:spacing w:before="100" w:beforeAutospacing="1" w:after="100" w:afterAutospacing="1" w:line="240" w:lineRule="auto"/>
+        <w:rPr>
+          <w:rFonts w:ascii="Segoe UI" w:eastAsia="Times New Roman" w:hAnsi="Segoe UI" w:cs="Segoe UI"/>
+          <w:kern w:val="0"/>
+          <w:sz w:val="24"/>
+          <w:szCs w:val="24"/>
+          <w:lang w:val="en-US"/>
+          <w14:ligatures w14:val="none"/>
+        </w:rPr>
+      </w:pPr>
+      <w:r>
+        <w:rPr>
+          <w:rFonts w:ascii="Segoe UI" w:eastAsia="Times New Roman" w:hAnsi="Segoe UI" w:cs="Segoe UI"/>
+          <w:kern w:val="0"/>
+          <w:sz w:val="24"/>
+          <w:szCs w:val="24"/>
+          <w:lang w:val="en-US"/>
+          <w14:ligatures w14:val="none"/>
+        </w:rPr>
+        <w:t>Post-simulation window/plots with matplotlib:</w:t>
+      </w:r>
+    </w:p>
+    <w:p>
+      <w:pPr>
+        <w:numPr>
+          <w:ilvl w:val="4"/>
+          <w:numId w:val="2"/>
+        </w:numPr>
+        <w:spacing w:before="100" w:beforeAutospacing="1" w:after="100" w:afterAutospacing="1" w:line="240" w:lineRule="auto"/>
+        <w:rPr>
+          <w:rFonts w:ascii="Segoe UI" w:eastAsia="Times New Roman" w:hAnsi="Segoe UI" w:cs="Segoe UI"/>
+          <w:kern w:val="0"/>
+          <w:sz w:val="24"/>
+          <w:szCs w:val="24"/>
+          <w:lang w:val="en-US"/>
+          <w14:ligatures w14:val="none"/>
+        </w:rPr>
+      </w:pPr>
+      <w:r>
+        <w:rPr>
+          <w:rFonts w:ascii="Segoe UI" w:eastAsia="Times New Roman" w:hAnsi="Segoe UI" w:cs="Segoe UI"/>
+          <w:kern w:val="0"/>
+          <w:sz w:val="24"/>
+          <w:szCs w:val="24"/>
+          <w:lang w:val="en-US"/>
+          <w14:ligatures w14:val="none"/>
+        </w:rPr>
+        <w:t xml:space="preserve">metrics over time (served, expired, </w:t>
+      </w:r>
+      <w:proofErr w:type="spellStart"/>
+      <w:r>
+        <w:rPr>
+          <w:rFonts w:ascii="Segoe UI" w:eastAsia="Times New Roman" w:hAnsi="Segoe UI" w:cs="Segoe UI"/>
+          <w:kern w:val="0"/>
+          <w:sz w:val="24"/>
+          <w:szCs w:val="24"/>
+          <w:lang w:val="en-US"/>
+          <w14:ligatures w14:val="none"/>
+        </w:rPr>
+        <w:t>avg_wait</w:t>
+      </w:r>
+      <w:proofErr w:type="spellEnd"/>
+      <w:r>
+        <w:rPr>
+          <w:rFonts w:ascii="Segoe UI" w:eastAsia="Times New Roman" w:hAnsi="Segoe UI" w:cs="Segoe UI"/>
+          <w:kern w:val="0"/>
+          <w:sz w:val="24"/>
+          <w:szCs w:val="24"/>
+          <w:lang w:val="en-US"/>
+          <w14:ligatures w14:val="none"/>
+        </w:rPr>
+        <w:t>, maybe earnings).</w:t>
+      </w:r>
+    </w:p>
+    <w:p>
+      <w:pPr>
+        <w:numPr>
+          <w:ilvl w:val="2"/>
+          <w:numId w:val="2"/>
+        </w:numPr>
+        <w:spacing w:before="100" w:beforeAutospacing="1" w:after="100" w:afterAutospacing="1" w:line="240" w:lineRule="auto"/>
+        <w:rPr>
+          <w:rFonts w:ascii="Segoe UI" w:eastAsia="Times New Roman" w:hAnsi="Segoe UI" w:cs="Segoe UI"/>
+          <w:kern w:val="0"/>
+          <w:sz w:val="24"/>
+          <w:szCs w:val="24"/>
+          <w:lang w:val="en-US"/>
+          <w14:ligatures w14:val="none"/>
+        </w:rPr>
+      </w:pPr>
+      <w:r>
+        <w:rPr>
+          <w:rFonts w:ascii="Segoe UI" w:eastAsia="Times New Roman" w:hAnsi="Segoe UI" w:cs="Segoe UI"/>
+          <w:kern w:val="0"/>
+          <w:sz w:val="24"/>
+          <w:szCs w:val="24"/>
+          <w:lang w:val="en-US"/>
+          <w14:ligatures w14:val="none"/>
+        </w:rPr>
+        <w:t>Ensure:</w:t>
+      </w:r>
+    </w:p>
+    <w:p>
+      <w:pPr>
+        <w:numPr>
+          <w:ilvl w:val="3"/>
+          <w:numId w:val="2"/>
+        </w:numPr>
+        <w:spacing w:before="100" w:beforeAutospacing="1" w:after="100" w:afterAutospacing="1" w:line="240" w:lineRule="auto"/>
+        <w:rPr>
+          <w:rFonts w:ascii="Segoe UI" w:eastAsia="Times New Roman" w:hAnsi="Segoe UI" w:cs="Segoe UI"/>
+          <w:kern w:val="0"/>
+          <w:sz w:val="24"/>
+          <w:szCs w:val="24"/>
+          <w:lang w:val="en-US"/>
+          <w14:ligatures w14:val="none"/>
+        </w:rPr>
+      </w:pPr>
+      <w:r>
+        <w:rPr>
+          <w:rFonts w:ascii="Segoe UI" w:eastAsia="Times New Roman" w:hAnsi="Segoe UI" w:cs="Segoe UI"/>
+          <w:kern w:val="0"/>
+          <w:sz w:val="24"/>
+          <w:szCs w:val="24"/>
+          <w:lang w:val="en-US"/>
+          <w14:ligatures w14:val="none"/>
+        </w:rPr>
+        <w:lastRenderedPageBreak/>
+        <w:t>No global variables (learn from Phase 1 feedback).</w:t>
+      </w:r>
+    </w:p>
+    <w:p>
+      <w:pPr>
+        <w:numPr>
+          <w:ilvl w:val="3"/>
+          <w:numId w:val="2"/>
+        </w:numPr>
+        <w:spacing w:before="100" w:beforeAutospacing="1" w:after="100" w:afterAutospacing="1" w:line="240" w:lineRule="auto"/>
+        <w:rPr>
+          <w:rFonts w:ascii="Segoe UI" w:eastAsia="Times New Roman" w:hAnsi="Segoe UI" w:cs="Segoe UI"/>
+          <w:kern w:val="0"/>
+          <w:sz w:val="24"/>
+          <w:szCs w:val="24"/>
+          <w:lang w:val="en-US"/>
+          <w14:ligatures w14:val="none"/>
+        </w:rPr>
+      </w:pPr>
+      <w:r>
+        <w:rPr>
+          <w:rFonts w:ascii="Segoe UI" w:eastAsia="Times New Roman" w:hAnsi="Segoe UI" w:cs="Segoe UI"/>
+          <w:kern w:val="0"/>
+          <w:sz w:val="24"/>
+          <w:szCs w:val="24"/>
+          <w:lang w:val="en-US"/>
+          <w14:ligatures w14:val="none"/>
+        </w:rPr>
+        <w:t>Clean separation into modules (core.py, policies.py, simulation.py, adapter.py, etc.).</w:t>
+      </w:r>
+    </w:p>
+    <w:p>
+      <w:pPr>
+        <w:pStyle w:val="ListParagraph"/>
+        <w:numPr>
+          <w:ilvl w:val="2"/>
+          <w:numId w:val="2"/>
+        </w:numPr>
+        <w:rPr>
+          <w:lang w:val="en-US"/>
+        </w:rPr>
+      </w:pPr>
+    </w:p>
+    <w:p>
+      <w:pPr>
+        <w:pStyle w:val="ListParagraph"/>
+        <w:numPr>
+          <w:ilvl w:val="1"/>
+          <w:numId w:val="2"/>
+        </w:numPr>
+        <w:rPr>
+          <w:lang w:val="en-US"/>
+        </w:rPr>
+      </w:pPr>
+      <w:r>
+        <w:rPr>
+          <w:lang w:val="en-US"/>
+        </w:rPr>
+        <w:t>Bipasha</w:t>
+      </w:r>
+      <w:r>
+        <w:rPr>
+          <w:lang w:val="en-US"/>
+        </w:rPr>
+        <w:t xml:space="preserve"> (Person B)</w:t>
+      </w:r>
+    </w:p>
+    <w:p>
+      <w:pPr>
+        <w:numPr>
+          <w:ilvl w:val="2"/>
+          <w:numId w:val="2"/>
+        </w:numPr>
+        <w:spacing w:before="100" w:beforeAutospacing="1" w:after="100" w:afterAutospacing="1" w:line="240" w:lineRule="auto"/>
+        <w:rPr>
+          <w:rFonts w:ascii="Segoe UI" w:eastAsia="Times New Roman" w:hAnsi="Segoe UI" w:cs="Segoe UI"/>
+          <w:kern w:val="0"/>
+          <w:sz w:val="24"/>
+          <w:szCs w:val="24"/>
+          <w:lang w:val="en-US"/>
+          <w14:ligatures w14:val="none"/>
+        </w:rPr>
+      </w:pPr>
+      <w:r>
+        <w:rPr>
+          <w:rFonts w:ascii="Segoe UI" w:eastAsia="Times New Roman" w:hAnsi="Segoe UI" w:cs="Segoe UI"/>
+          <w:kern w:val="0"/>
+          <w:sz w:val="24"/>
+          <w:szCs w:val="24"/>
+          <w:lang w:val="en-US"/>
+          <w14:ligatures w14:val="none"/>
+        </w:rPr>
+        <w:t>Implement:</w:t>
+      </w:r>
+    </w:p>
+    <w:p>
+      <w:pPr>
+        <w:numPr>
+          <w:ilvl w:val="3"/>
+          <w:numId w:val="2"/>
+        </w:numPr>
+        <w:spacing w:before="100" w:beforeAutospacing="1" w:after="100" w:afterAutospacing="1" w:line="240" w:lineRule="auto"/>
+        <w:rPr>
+          <w:rFonts w:ascii="Segoe UI" w:eastAsia="Times New Roman" w:hAnsi="Segoe UI" w:cs="Segoe UI"/>
+          <w:kern w:val="0"/>
+          <w:sz w:val="24"/>
+          <w:szCs w:val="24"/>
+          <w:lang w:val="en-US"/>
+          <w14:ligatures w14:val="none"/>
+        </w:rPr>
+      </w:pPr>
+      <w:proofErr w:type="spellStart"/>
+      <w:r>
+        <w:rPr>
+          <w:rFonts w:ascii="Segoe UI" w:eastAsia="Times New Roman" w:hAnsi="Segoe UI" w:cs="Segoe UI"/>
+          <w:kern w:val="0"/>
+          <w:sz w:val="24"/>
+          <w:szCs w:val="24"/>
+          <w:lang w:val="en-US"/>
+          <w14:ligatures w14:val="none"/>
+        </w:rPr>
+        <w:t>DispatchPolicy</w:t>
+      </w:r>
+      <w:proofErr w:type="spellEnd"/>
+      <w:r>
+        <w:rPr>
+          <w:rFonts w:ascii="Segoe UI" w:eastAsia="Times New Roman" w:hAnsi="Segoe UI" w:cs="Segoe UI"/>
+          <w:kern w:val="0"/>
+          <w:sz w:val="24"/>
+          <w:szCs w:val="24"/>
+          <w:lang w:val="en-US"/>
+          <w14:ligatures w14:val="none"/>
+        </w:rPr>
+        <w:t xml:space="preserve"> base +:</w:t>
+      </w:r>
+    </w:p>
+    <w:p>
+      <w:pPr>
+        <w:numPr>
+          <w:ilvl w:val="4"/>
+          <w:numId w:val="2"/>
+        </w:numPr>
+        <w:spacing w:before="100" w:beforeAutospacing="1" w:after="100" w:afterAutospacing="1" w:line="240" w:lineRule="auto"/>
+        <w:rPr>
+          <w:rFonts w:ascii="Segoe UI" w:eastAsia="Times New Roman" w:hAnsi="Segoe UI" w:cs="Segoe UI"/>
+          <w:kern w:val="0"/>
+          <w:sz w:val="24"/>
+          <w:szCs w:val="24"/>
+          <w:lang w:val="en-US"/>
+          <w14:ligatures w14:val="none"/>
+        </w:rPr>
+      </w:pPr>
+      <w:proofErr w:type="spellStart"/>
+      <w:r>
+        <w:rPr>
+          <w:rFonts w:ascii="Segoe UI" w:eastAsia="Times New Roman" w:hAnsi="Segoe UI" w:cs="Segoe UI"/>
+          <w:kern w:val="0"/>
+          <w:sz w:val="24"/>
+          <w:szCs w:val="24"/>
+          <w:lang w:val="en-US"/>
+          <w14:ligatures w14:val="none"/>
+        </w:rPr>
+        <w:t>NearestNeighborPolicy</w:t>
+      </w:r>
+      <w:proofErr w:type="spellEnd"/>
+    </w:p>
+    <w:p>
+      <w:pPr>
+        <w:numPr>
+          <w:ilvl w:val="4"/>
+          <w:numId w:val="2"/>
+        </w:numPr>
+        <w:spacing w:before="100" w:beforeAutospacing="1" w:after="100" w:afterAutospacing="1" w:line="240" w:lineRule="auto"/>
+        <w:rPr>
+          <w:rFonts w:ascii="Segoe UI" w:eastAsia="Times New Roman" w:hAnsi="Segoe UI" w:cs="Segoe UI"/>
+          <w:kern w:val="0"/>
+          <w:sz w:val="24"/>
+          <w:szCs w:val="24"/>
+          <w:lang w:val="en-US"/>
+          <w14:ligatures w14:val="none"/>
+        </w:rPr>
+      </w:pPr>
+      <w:proofErr w:type="spellStart"/>
+      <w:r>
+        <w:rPr>
+          <w:rFonts w:ascii="Segoe UI" w:eastAsia="Times New Roman" w:hAnsi="Segoe UI" w:cs="Segoe UI"/>
+          <w:kern w:val="0"/>
+          <w:sz w:val="24"/>
+          <w:szCs w:val="24"/>
+          <w:lang w:val="en-US"/>
+          <w14:ligatures w14:val="none"/>
+        </w:rPr>
+        <w:t>GlobalGreedyPolicy</w:t>
+      </w:r>
+      <w:proofErr w:type="spellEnd"/>
+    </w:p>
+    <w:p>
+      <w:pPr>
+        <w:numPr>
+          <w:ilvl w:val="4"/>
+          <w:numId w:val="2"/>
+        </w:numPr>
+        <w:spacing w:before="100" w:beforeAutospacing="1" w:after="100" w:afterAutospacing="1" w:line="240" w:lineRule="auto"/>
+        <w:rPr>
+          <w:rFonts w:ascii="Segoe UI" w:eastAsia="Times New Roman" w:hAnsi="Segoe UI" w:cs="Segoe UI"/>
+          <w:kern w:val="0"/>
+          <w:sz w:val="24"/>
+          <w:szCs w:val="24"/>
+          <w:lang w:val="en-US"/>
+          <w14:ligatures w14:val="none"/>
+        </w:rPr>
+      </w:pPr>
+      <w:r>
+        <w:rPr>
+          <w:rFonts w:ascii="Segoe UI" w:eastAsia="Times New Roman" w:hAnsi="Segoe UI" w:cs="Segoe UI"/>
+          <w:kern w:val="0"/>
+          <w:sz w:val="24"/>
+          <w:szCs w:val="24"/>
+          <w:lang w:val="en-US"/>
+          <w14:ligatures w14:val="none"/>
+        </w:rPr>
+        <w:t>optional fancy one.</w:t>
+      </w:r>
+    </w:p>
+    <w:p>
+      <w:pPr>
+        <w:numPr>
+          <w:ilvl w:val="3"/>
+          <w:numId w:val="2"/>
+        </w:numPr>
+        <w:spacing w:before="100" w:beforeAutospacing="1" w:after="100" w:afterAutospacing="1" w:line="240" w:lineRule="auto"/>
+        <w:rPr>
+          <w:rFonts w:ascii="Segoe UI" w:eastAsia="Times New Roman" w:hAnsi="Segoe UI" w:cs="Segoe UI"/>
+          <w:kern w:val="0"/>
+          <w:sz w:val="24"/>
+          <w:szCs w:val="24"/>
+          <w:lang w:val="en-US"/>
+          <w14:ligatures w14:val="none"/>
+        </w:rPr>
+      </w:pPr>
+      <w:proofErr w:type="spellStart"/>
+      <w:r>
+        <w:rPr>
+          <w:rFonts w:ascii="Segoe UI" w:eastAsia="Times New Roman" w:hAnsi="Segoe UI" w:cs="Segoe UI"/>
+          <w:kern w:val="0"/>
+          <w:sz w:val="24"/>
+          <w:szCs w:val="24"/>
+          <w:lang w:val="en-US"/>
+          <w14:ligatures w14:val="none"/>
+        </w:rPr>
+        <w:t>DriverBehaviour</w:t>
+      </w:r>
+      <w:proofErr w:type="spellEnd"/>
+      <w:r>
+        <w:rPr>
+          <w:rFonts w:ascii="Segoe UI" w:eastAsia="Times New Roman" w:hAnsi="Segoe UI" w:cs="Segoe UI"/>
+          <w:kern w:val="0"/>
+          <w:sz w:val="24"/>
+          <w:szCs w:val="24"/>
+          <w:lang w:val="en-US"/>
+          <w14:ligatures w14:val="none"/>
+        </w:rPr>
+        <w:t xml:space="preserve"> base + at least 2 implementations:</w:t>
+      </w:r>
+    </w:p>
+    <w:p>
+      <w:pPr>
+        <w:numPr>
+          <w:ilvl w:val="4"/>
+          <w:numId w:val="2"/>
+        </w:numPr>
+        <w:spacing w:before="100" w:beforeAutospacing="1" w:after="100" w:afterAutospacing="1" w:line="240" w:lineRule="auto"/>
+        <w:rPr>
+          <w:rFonts w:ascii="Segoe UI" w:eastAsia="Times New Roman" w:hAnsi="Segoe UI" w:cs="Segoe UI"/>
+          <w:kern w:val="0"/>
+          <w:sz w:val="24"/>
+          <w:szCs w:val="24"/>
+          <w:lang w:val="en-US"/>
+          <w14:ligatures w14:val="none"/>
+        </w:rPr>
+      </w:pPr>
+      <w:r>
+        <w:rPr>
+          <w:rFonts w:ascii="Segoe UI" w:eastAsia="Times New Roman" w:hAnsi="Segoe UI" w:cs="Segoe UI"/>
+          <w:kern w:val="0"/>
+          <w:sz w:val="24"/>
+          <w:szCs w:val="24"/>
+          <w:lang w:val="en-US"/>
+          <w14:ligatures w14:val="none"/>
+        </w:rPr>
+        <w:t xml:space="preserve">e.g. </w:t>
+      </w:r>
+      <w:proofErr w:type="spellStart"/>
+      <w:r>
+        <w:rPr>
+          <w:rFonts w:ascii="Segoe UI" w:eastAsia="Times New Roman" w:hAnsi="Segoe UI" w:cs="Segoe UI"/>
+          <w:kern w:val="0"/>
+          <w:sz w:val="24"/>
+          <w:szCs w:val="24"/>
+          <w:lang w:val="en-US"/>
+          <w14:ligatures w14:val="none"/>
+        </w:rPr>
+        <w:t>GreedyDistanceBehaviour</w:t>
+      </w:r>
+      <w:proofErr w:type="spellEnd"/>
+      <w:r>
+        <w:rPr>
+          <w:rFonts w:ascii="Segoe UI" w:eastAsia="Times New Roman" w:hAnsi="Segoe UI" w:cs="Segoe UI"/>
+          <w:kern w:val="0"/>
+          <w:sz w:val="24"/>
+          <w:szCs w:val="24"/>
+          <w:lang w:val="en-US"/>
+          <w14:ligatures w14:val="none"/>
+        </w:rPr>
+        <w:t xml:space="preserve">, </w:t>
+      </w:r>
+      <w:proofErr w:type="spellStart"/>
+      <w:r>
+        <w:rPr>
+          <w:rFonts w:ascii="Segoe UI" w:eastAsia="Times New Roman" w:hAnsi="Segoe UI" w:cs="Segoe UI"/>
+          <w:kern w:val="0"/>
+          <w:sz w:val="24"/>
+          <w:szCs w:val="24"/>
+          <w:lang w:val="en-US"/>
+          <w14:ligatures w14:val="none"/>
+        </w:rPr>
+        <w:t>EarningsMaxBehaviour</w:t>
+      </w:r>
+      <w:proofErr w:type="spellEnd"/>
+      <w:r>
+        <w:rPr>
+          <w:rFonts w:ascii="Segoe UI" w:eastAsia="Times New Roman" w:hAnsi="Segoe UI" w:cs="Segoe UI"/>
+          <w:kern w:val="0"/>
+          <w:sz w:val="24"/>
+          <w:szCs w:val="24"/>
+          <w:lang w:val="en-US"/>
+          <w14:ligatures w14:val="none"/>
+        </w:rPr>
+        <w:t xml:space="preserve">, </w:t>
+      </w:r>
+      <w:proofErr w:type="spellStart"/>
+      <w:r>
+        <w:rPr>
+          <w:rFonts w:ascii="Segoe UI" w:eastAsia="Times New Roman" w:hAnsi="Segoe UI" w:cs="Segoe UI"/>
+          <w:kern w:val="0"/>
+          <w:sz w:val="24"/>
+          <w:szCs w:val="24"/>
+          <w:lang w:val="en-US"/>
+          <w14:ligatures w14:val="none"/>
+        </w:rPr>
+        <w:t>LazyBehaviour</w:t>
+      </w:r>
+      <w:proofErr w:type="spellEnd"/>
+      <w:r>
+        <w:rPr>
+          <w:rFonts w:ascii="Segoe UI" w:eastAsia="Times New Roman" w:hAnsi="Segoe UI" w:cs="Segoe UI"/>
+          <w:kern w:val="0"/>
+          <w:sz w:val="24"/>
+          <w:szCs w:val="24"/>
+          <w:lang w:val="en-US"/>
+          <w14:ligatures w14:val="none"/>
+        </w:rPr>
+        <w:t>.</w:t>
+      </w:r>
+    </w:p>
+    <w:p>
+      <w:pPr>
+        <w:numPr>
+          <w:ilvl w:val="3"/>
+          <w:numId w:val="2"/>
+        </w:numPr>
+        <w:spacing w:before="100" w:beforeAutospacing="1" w:after="100" w:afterAutospacing="1" w:line="240" w:lineRule="auto"/>
+        <w:rPr>
+          <w:rFonts w:ascii="Segoe UI" w:eastAsia="Times New Roman" w:hAnsi="Segoe UI" w:cs="Segoe UI"/>
+          <w:kern w:val="0"/>
+          <w:sz w:val="24"/>
+          <w:szCs w:val="24"/>
+          <w:lang w:val="en-US"/>
+          <w14:ligatures w14:val="none"/>
+        </w:rPr>
+      </w:pPr>
+      <w:proofErr w:type="spellStart"/>
+      <w:r>
+        <w:rPr>
+          <w:rFonts w:ascii="Segoe UI" w:eastAsia="Times New Roman" w:hAnsi="Segoe UI" w:cs="Segoe UI"/>
+          <w:kern w:val="0"/>
+          <w:sz w:val="24"/>
+          <w:szCs w:val="24"/>
+          <w:lang w:val="en-US"/>
+          <w14:ligatures w14:val="none"/>
+        </w:rPr>
+        <w:t>MutationRule</w:t>
+      </w:r>
+      <w:proofErr w:type="spellEnd"/>
+      <w:r>
+        <w:rPr>
+          <w:rFonts w:ascii="Segoe UI" w:eastAsia="Times New Roman" w:hAnsi="Segoe UI" w:cs="Segoe UI"/>
+          <w:kern w:val="0"/>
+          <w:sz w:val="24"/>
+          <w:szCs w:val="24"/>
+          <w:lang w:val="en-US"/>
+          <w14:ligatures w14:val="none"/>
+        </w:rPr>
+        <w:t xml:space="preserve"> (+ one non-trivial rule).</w:t>
+      </w:r>
+    </w:p>
+    <w:p>
+      <w:pPr>
+        <w:numPr>
+          <w:ilvl w:val="2"/>
+          <w:numId w:val="2"/>
+        </w:numPr>
+        <w:spacing w:before="100" w:beforeAutospacing="1" w:after="100" w:afterAutospacing="1" w:line="240" w:lineRule="auto"/>
+        <w:rPr>
+          <w:rFonts w:ascii="Segoe UI" w:eastAsia="Times New Roman" w:hAnsi="Segoe UI" w:cs="Segoe UI"/>
+          <w:kern w:val="0"/>
+          <w:sz w:val="24"/>
+          <w:szCs w:val="24"/>
+          <w:lang w:val="en-US"/>
+          <w14:ligatures w14:val="none"/>
+        </w:rPr>
+      </w:pPr>
+      <w:r>
+        <w:rPr>
+          <w:rFonts w:ascii="Segoe UI" w:eastAsia="Times New Roman" w:hAnsi="Segoe UI" w:cs="Segoe UI"/>
+          <w:kern w:val="0"/>
+          <w:sz w:val="24"/>
+          <w:szCs w:val="24"/>
+          <w:lang w:val="en-US"/>
+          <w14:ligatures w14:val="none"/>
+        </w:rPr>
+        <w:t>Small test script or unit tests:</w:t>
+      </w:r>
+    </w:p>
+    <w:p>
+      <w:pPr>
+        <w:numPr>
+          <w:ilvl w:val="3"/>
+          <w:numId w:val="2"/>
+        </w:numPr>
+        <w:spacing w:before="100" w:beforeAutospacing="1" w:after="100" w:afterAutospacing="1" w:line="240" w:lineRule="auto"/>
+        <w:rPr>
+          <w:rFonts w:ascii="Segoe UI" w:eastAsia="Times New Roman" w:hAnsi="Segoe UI" w:cs="Segoe UI"/>
+          <w:kern w:val="0"/>
+          <w:sz w:val="24"/>
+          <w:szCs w:val="24"/>
+          <w:lang w:val="en-US"/>
+          <w14:ligatures w14:val="none"/>
+        </w:rPr>
+      </w:pPr>
+      <w:r>
+        <w:rPr>
+          <w:rFonts w:ascii="Segoe UI" w:eastAsia="Times New Roman" w:hAnsi="Segoe UI" w:cs="Segoe UI"/>
+          <w:kern w:val="0"/>
+          <w:sz w:val="24"/>
+          <w:szCs w:val="24"/>
+          <w:lang w:val="en-US"/>
+          <w14:ligatures w14:val="none"/>
+        </w:rPr>
+        <w:t>Check that policies choose sensible matches.</w:t>
+      </w:r>
+    </w:p>
+    <w:p>
+      <w:pPr>
+        <w:numPr>
+          <w:ilvl w:val="3"/>
+          <w:numId w:val="2"/>
+        </w:numPr>
+        <w:spacing w:before="100" w:beforeAutospacing="1" w:after="100" w:afterAutospacing="1" w:line="240" w:lineRule="auto"/>
+        <w:rPr>
+          <w:rFonts w:ascii="Segoe UI" w:eastAsia="Times New Roman" w:hAnsi="Segoe UI" w:cs="Segoe UI"/>
+          <w:kern w:val="0"/>
+          <w:sz w:val="24"/>
+          <w:szCs w:val="24"/>
+          <w:lang w:val="en-US"/>
+          <w14:ligatures w14:val="none"/>
+        </w:rPr>
+      </w:pPr>
+      <w:r>
+        <w:rPr>
+          <w:rFonts w:ascii="Segoe UI" w:eastAsia="Times New Roman" w:hAnsi="Segoe UI" w:cs="Segoe UI"/>
+          <w:kern w:val="0"/>
+          <w:sz w:val="24"/>
+          <w:szCs w:val="24"/>
+          <w:lang w:val="en-US"/>
+          <w14:ligatures w14:val="none"/>
+        </w:rPr>
+        <w:t xml:space="preserve">Check that </w:t>
+      </w:r>
+      <w:proofErr w:type="spellStart"/>
+      <w:r>
+        <w:rPr>
+          <w:rFonts w:ascii="Segoe UI" w:eastAsia="Times New Roman" w:hAnsi="Segoe UI" w:cs="Segoe UI"/>
+          <w:kern w:val="0"/>
+          <w:sz w:val="24"/>
+          <w:szCs w:val="24"/>
+          <w:lang w:val="en-US"/>
+          <w14:ligatures w14:val="none"/>
+        </w:rPr>
+        <w:t>behaviours</w:t>
+      </w:r>
+      <w:proofErr w:type="spellEnd"/>
+      <w:r>
+        <w:rPr>
+          <w:rFonts w:ascii="Segoe UI" w:eastAsia="Times New Roman" w:hAnsi="Segoe UI" w:cs="Segoe UI"/>
+          <w:kern w:val="0"/>
+          <w:sz w:val="24"/>
+          <w:szCs w:val="24"/>
+          <w:lang w:val="en-US"/>
+          <w14:ligatures w14:val="none"/>
+        </w:rPr>
+        <w:t xml:space="preserve"> accept/reject as expected.</w:t>
+      </w:r>
+    </w:p>
+    <w:p>
+      <w:pPr>
+        <w:numPr>
+          <w:ilvl w:val="3"/>
+          <w:numId w:val="2"/>
+        </w:numPr>
+        <w:spacing w:before="100" w:beforeAutospacing="1" w:after="100" w:afterAutospacing="1" w:line="240" w:lineRule="auto"/>
+        <w:rPr>
+          <w:rFonts w:ascii="Segoe UI" w:eastAsia="Times New Roman" w:hAnsi="Segoe UI" w:cs="Segoe UI"/>
+          <w:kern w:val="0"/>
+          <w:sz w:val="24"/>
+          <w:szCs w:val="24"/>
+          <w:lang w:val="en-US"/>
+          <w14:ligatures w14:val="none"/>
+        </w:rPr>
+      </w:pPr>
+      <w:r>
+        <w:rPr>
+          <w:rFonts w:ascii="Segoe UI" w:eastAsia="Times New Roman" w:hAnsi="Segoe UI" w:cs="Segoe UI"/>
+          <w:kern w:val="0"/>
+          <w:sz w:val="24"/>
+          <w:szCs w:val="24"/>
+          <w:lang w:val="en-US"/>
+          <w14:ligatures w14:val="none"/>
+        </w:rPr>
+        <w:t xml:space="preserve">Check that mutation actually changes </w:t>
+      </w:r>
+      <w:proofErr w:type="spellStart"/>
+      <w:r>
+        <w:rPr>
+          <w:rFonts w:ascii="Segoe UI" w:eastAsia="Times New Roman" w:hAnsi="Segoe UI" w:cs="Segoe UI"/>
+          <w:kern w:val="0"/>
+          <w:sz w:val="24"/>
+          <w:szCs w:val="24"/>
+          <w:lang w:val="en-US"/>
+          <w14:ligatures w14:val="none"/>
+        </w:rPr>
+        <w:t>behaviour</w:t>
+      </w:r>
+      <w:proofErr w:type="spellEnd"/>
+      <w:r>
+        <w:rPr>
+          <w:rFonts w:ascii="Segoe UI" w:eastAsia="Times New Roman" w:hAnsi="Segoe UI" w:cs="Segoe UI"/>
+          <w:kern w:val="0"/>
+          <w:sz w:val="24"/>
+          <w:szCs w:val="24"/>
+          <w:lang w:val="en-US"/>
+          <w14:ligatures w14:val="none"/>
+        </w:rPr>
+        <w:t xml:space="preserve"> at runtime.</w:t>
+      </w:r>
+    </w:p>
+    <w:p>
+      <w:pPr>
+        <w:pStyle w:val="ListParagraph"/>
+        <w:numPr>
+          <w:ilvl w:val="2"/>
+          <w:numId w:val="2"/>
+        </w:numPr>
+        <w:rPr>
+          <w:lang w:val="en-US"/>
+        </w:rPr>
+      </w:pPr>
+    </w:p>
+    <w:p>
+      <w:pPr>
+        <w:pStyle w:val="ListParagraph"/>
+        <w:numPr>
+          <w:ilvl w:val="1"/>
+          <w:numId w:val="2"/>
+        </w:numPr>
+        <w:rPr>
+          <w:lang w:val="en-US"/>
+        </w:rPr>
+      </w:pPr>
+      <w:r>
+        <w:rPr>
+          <w:lang w:val="en-US"/>
+        </w:rPr>
+        <w:t>Janek</w:t>
+      </w:r>
+      <w:r>
+        <w:rPr>
+          <w:lang w:val="en-US"/>
+        </w:rPr>
+        <w:t xml:space="preserve"> (Person A)</w:t>
+      </w:r>
+    </w:p>
+    <w:p>
+      <w:pPr>
+        <w:pStyle w:val="ListParagraph"/>
+        <w:numPr>
+          <w:ilvl w:val="2"/>
+          <w:numId w:val="2"/>
+        </w:numPr>
+        <w:rPr>
+          <w:lang w:val="en-US"/>
+        </w:rPr>
+      </w:pPr>
+      <w:r>
+        <w:rPr>
+          <w:lang w:val="en-US"/>
+        </w:rPr>
+        <w:t>Implement:</w:t>
+      </w:r>
+    </w:p>
+    <w:p>
+      <w:pPr>
+        <w:pStyle w:val="ListParagraph"/>
+        <w:numPr>
+          <w:ilvl w:val="3"/>
+          <w:numId w:val="2"/>
+        </w:numPr>
+        <w:rPr>
+          <w:lang w:val="en-US"/>
+        </w:rPr>
+      </w:pPr>
+      <w:r>
+        <w:rPr>
+          <w:lang w:val="en-US"/>
+        </w:rPr>
+        <w:t xml:space="preserve">Point (with all the magic methods, </w:t>
+      </w:r>
+      <w:proofErr w:type="spellStart"/>
+      <w:r>
+        <w:rPr>
+          <w:lang w:val="en-US"/>
+        </w:rPr>
+        <w:t>distance_to</w:t>
+      </w:r>
+      <w:proofErr w:type="spellEnd"/>
+      <w:r>
+        <w:rPr>
+          <w:lang w:val="en-US"/>
+        </w:rPr>
+        <w:t>)</w:t>
+      </w:r>
+    </w:p>
+    <w:p>
+      <w:pPr>
+        <w:pStyle w:val="ListParagraph"/>
+        <w:numPr>
+          <w:ilvl w:val="3"/>
+          <w:numId w:val="2"/>
+        </w:numPr>
+        <w:rPr>
+          <w:lang w:val="en-US"/>
+        </w:rPr>
+      </w:pPr>
+      <w:r>
+        <w:rPr>
+          <w:lang w:val="en-US"/>
+        </w:rPr>
+        <w:t>Request (states + transitions + wait time updates)</w:t>
+      </w:r>
+    </w:p>
+    <w:p>
+      <w:pPr>
+        <w:pStyle w:val="ListParagraph"/>
+        <w:numPr>
+          <w:ilvl w:val="3"/>
+          <w:numId w:val="2"/>
+        </w:numPr>
+        <w:rPr>
+          <w:lang w:val="en-US"/>
+        </w:rPr>
+      </w:pPr>
+      <w:r>
+        <w:rPr>
+          <w:lang w:val="en-US"/>
+        </w:rPr>
+        <w:t>Driver (movement, status transitions, history)</w:t>
+      </w:r>
+    </w:p>
+    <w:p>
+      <w:pPr>
+        <w:pStyle w:val="ListParagraph"/>
+        <w:numPr>
+          <w:ilvl w:val="3"/>
+          <w:numId w:val="2"/>
+        </w:numPr>
+        <w:rPr>
+          <w:lang w:val="en-US"/>
+        </w:rPr>
+      </w:pPr>
+      <w:r>
+        <w:rPr>
+          <w:lang w:val="en-US"/>
+        </w:rPr>
+        <w:t>Offer</w:t>
+      </w:r>
+    </w:p>
+    <w:p>
+      <w:pPr>
+        <w:pStyle w:val="ListParagraph"/>
+        <w:numPr>
+          <w:ilvl w:val="3"/>
+          <w:numId w:val="2"/>
+        </w:numPr>
+        <w:rPr>
+          <w:lang w:val="en-US"/>
+        </w:rPr>
+      </w:pPr>
+      <w:proofErr w:type="spellStart"/>
+      <w:r>
+        <w:rPr>
+          <w:lang w:val="en-US"/>
+        </w:rPr>
+        <w:t>RequestGenerator.maybe_generate</w:t>
+      </w:r>
+      <w:proofErr w:type="spellEnd"/>
+    </w:p>
+    <w:p>
+      <w:pPr>
+        <w:pStyle w:val="ListParagraph"/>
+        <w:numPr>
+          <w:ilvl w:val="2"/>
+          <w:numId w:val="2"/>
+        </w:numPr>
+        <w:rPr>
+          <w:lang w:val="en-US"/>
+        </w:rPr>
+      </w:pPr>
+      <w:r>
+        <w:rPr>
+          <w:lang w:val="en-US"/>
+        </w:rPr>
+        <w:t>Add basic unit tests for these classes.</w:t>
+      </w:r>
+    </w:p>
+    <w:p>
+      <w:pPr>
+        <w:pStyle w:val="ListParagraph"/>
+        <w:numPr>
+          <w:ilvl w:val="2"/>
+          <w:numId w:val="2"/>
+        </w:numPr>
+        <w:rPr>
+          <w:lang w:val="en-US"/>
+        </w:rPr>
+      </w:pPr>
+      <w:r>
+        <w:rPr>
+          <w:lang w:val="en-US"/>
+        </w:rPr>
+        <w:t xml:space="preserve">Make sure types, </w:t>
+      </w:r>
+      <w:proofErr w:type="spellStart"/>
+      <w:r>
+        <w:rPr>
+          <w:lang w:val="en-US"/>
+        </w:rPr>
+        <w:t>enums</w:t>
+      </w:r>
+      <w:proofErr w:type="spellEnd"/>
+      <w:r>
+        <w:rPr>
+          <w:lang w:val="en-US"/>
+        </w:rPr>
+        <w:t>/strings for statuses etc. are consistent.</w:t>
+      </w:r>
+    </w:p>
+    <w:p>
+      <w:pPr>
+        <w:pStyle w:val="ListParagraph"/>
+        <w:ind w:left="2160"/>
+        <w:rPr>
+          <w:lang w:val="en-US"/>
+        </w:rPr>
+      </w:pPr>
     </w:p>
     <w:sectPr>
       <w:pgSz w:w="11906" w:h="16838"/>
@@ -607,6 +1917,155 @@
 <file path=word/numbering.xml><?xml version="1.0" encoding="utf-8"?>
 <w:numbering xmlns:wpc="http://schemas.microsoft.com/office/word/2010/wordprocessingCanvas" xmlns:cx="http://schemas.microsoft.com/office/drawing/2014/chartex" xmlns:cx1="http://schemas.microsoft.com/office/drawing/2015/9/8/chartex" xmlns:cx2="http://schemas.microsoft.com/office/drawing/2015/10/21/chartex" xmlns:cx3="http://schemas.microsoft.com/office/drawing/2016/5/9/chartex" xmlns:cx4="http://schemas.microsoft.com/office/drawing/2016/5/10/chartex" xmlns:cx5="http://schemas.microsoft.com/office/drawing/2016/5/11/chartex" xmlns:cx6="http://schemas.microsoft.com/office/drawing/2016/5/12/chartex" xmlns:cx7="http://schemas.microsoft.com/office/drawing/2016/5/13/chartex" xmlns:cx8="http://schemas.microsoft.com/office/drawing/2016/5/14/chartex" xmlns:mc="http://schemas.openxmlformats.org/markup-compatibility/2006" xmlns:aink="http://schemas.microsoft.com/office/drawing/2016/ink" xmlns:am3d="http://schemas.microsoft.com/office/drawing/2017/model3d" xmlns:o="urn:schemas-microsoft-com:office:office" xmlns:oel="http://schemas.microsoft.com/office/2019/extlst" xmlns:r="http://schemas.openxmlformats.org/officeDocument/2006/relationships" xmlns:m="http://schemas.openxmlformats.org/officeDocument/2006/math" xmlns:v="urn:schemas-microsoft-com:vml" xmlns:wp14="http://schemas.microsoft.com/office/word/2010/wordprocessingDrawing" xmlns:wp="http://schemas.openxmlformats.org/drawingml/2006/wordprocessingDrawing" xmlns:w10="urn:schemas-microsoft-com:office:word" xmlns:w="http://schemas.openxmlformats.org/wordprocessingml/2006/main" xmlns:w14="http://schemas.microsoft.com/office/word/2010/wordml" xmlns:w15="http://schemas.microsoft.com/office/word/2012/wordml" xmlns:w16cex="http://schemas.microsoft.com/office/word/2018/wordml/cex" xmlns:w16cid="http://schemas.microsoft.com/office/word/2016/wordml/cid" xmlns:w16="http://schemas.microsoft.com/office/word/2018/wordml" xmlns:w16du="http://schemas.microsoft.com/office/word/2023/wordml/word16du" xmlns:w16sdtdh="http://schemas.microsoft.com/office/word/2020/wordml/sdtdatahash" xmlns:w16sdtfl="http://schemas.microsoft.com/office/word/2024/wordml/sdtformatlock" xmlns:w16se="http://schemas.microsoft.com/office/word/2015/wordml/symex" xmlns:wpg="http://schemas.microsoft.com/office/word/2010/wordprocessingGroup" xmlns:wpi="http://schemas.microsoft.com/office/word/2010/wordprocessingInk" xmlns:wne="http://schemas.microsoft.com/office/word/2006/wordml" xmlns:wps="http://schemas.microsoft.com/office/word/2010/wordprocessingShape" mc:Ignorable="w14 w15 w16se w16cid w16 w16cex w16sdtdh w16sdtfl w16du wp14">
   <w:abstractNum w:abstractNumId="0" w15:restartNumberingAfterBreak="0">
+    <w:nsid w:val="2FED56F0"/>
+    <w:multiLevelType w:val="multilevel"/>
+    <w:tmpl w:val="FD0C5386"/>
+    <w:lvl w:ilvl="0">
+      <w:start w:val="1"/>
+      <w:numFmt w:val="bullet"/>
+      <w:lvlText w:val=""/>
+      <w:lvlJc w:val="left"/>
+      <w:pPr>
+        <w:tabs>
+          <w:tab w:val="num" w:pos="720"/>
+        </w:tabs>
+        <w:ind w:left="720" w:hanging="360"/>
+      </w:pPr>
+      <w:rPr>
+        <w:rFonts w:ascii="Symbol" w:hAnsi="Symbol" w:hint="default"/>
+        <w:sz w:val="20"/>
+      </w:rPr>
+    </w:lvl>
+    <w:lvl w:ilvl="1">
+      <w:start w:val="1"/>
+      <w:numFmt w:val="bullet"/>
+      <w:lvlText w:val="o"/>
+      <w:lvlJc w:val="left"/>
+      <w:pPr>
+        <w:tabs>
+          <w:tab w:val="num" w:pos="1440"/>
+        </w:tabs>
+        <w:ind w:left="1440" w:hanging="360"/>
+      </w:pPr>
+      <w:rPr>
+        <w:rFonts w:ascii="Courier New" w:hAnsi="Courier New" w:hint="default"/>
+        <w:sz w:val="20"/>
+      </w:rPr>
+    </w:lvl>
+    <w:lvl w:ilvl="2">
+      <w:start w:val="1"/>
+      <w:numFmt w:val="bullet"/>
+      <w:lvlText w:val=""/>
+      <w:lvlJc w:val="left"/>
+      <w:pPr>
+        <w:tabs>
+          <w:tab w:val="num" w:pos="2160"/>
+        </w:tabs>
+        <w:ind w:left="2160" w:hanging="360"/>
+      </w:pPr>
+      <w:rPr>
+        <w:rFonts w:ascii="Wingdings" w:hAnsi="Wingdings" w:hint="default"/>
+        <w:sz w:val="20"/>
+      </w:rPr>
+    </w:lvl>
+    <w:lvl w:ilvl="3" w:tentative="1">
+      <w:start w:val="1"/>
+      <w:numFmt w:val="bullet"/>
+      <w:lvlText w:val=""/>
+      <w:lvlJc w:val="left"/>
+      <w:pPr>
+        <w:tabs>
+          <w:tab w:val="num" w:pos="2880"/>
+        </w:tabs>
+        <w:ind w:left="2880" w:hanging="360"/>
+      </w:pPr>
+      <w:rPr>
+        <w:rFonts w:ascii="Wingdings" w:hAnsi="Wingdings" w:hint="default"/>
+        <w:sz w:val="20"/>
+      </w:rPr>
+    </w:lvl>
+    <w:lvl w:ilvl="4" w:tentative="1">
+      <w:start w:val="1"/>
+      <w:numFmt w:val="bullet"/>
+      <w:lvlText w:val=""/>
+      <w:lvlJc w:val="left"/>
+      <w:pPr>
+        <w:tabs>
+          <w:tab w:val="num" w:pos="3600"/>
+        </w:tabs>
+        <w:ind w:left="3600" w:hanging="360"/>
+      </w:pPr>
+      <w:rPr>
+        <w:rFonts w:ascii="Wingdings" w:hAnsi="Wingdings" w:hint="default"/>
+        <w:sz w:val="20"/>
+      </w:rPr>
+    </w:lvl>
+    <w:lvl w:ilvl="5" w:tentative="1">
+      <w:start w:val="1"/>
+      <w:numFmt w:val="bullet"/>
+      <w:lvlText w:val=""/>
+      <w:lvlJc w:val="left"/>
+      <w:pPr>
+        <w:tabs>
+          <w:tab w:val="num" w:pos="4320"/>
+        </w:tabs>
+        <w:ind w:left="4320" w:hanging="360"/>
+      </w:pPr>
+      <w:rPr>
+        <w:rFonts w:ascii="Wingdings" w:hAnsi="Wingdings" w:hint="default"/>
+        <w:sz w:val="20"/>
+      </w:rPr>
+    </w:lvl>
+    <w:lvl w:ilvl="6" w:tentative="1">
+      <w:start w:val="1"/>
+      <w:numFmt w:val="bullet"/>
+      <w:lvlText w:val=""/>
+      <w:lvlJc w:val="left"/>
+      <w:pPr>
+        <w:tabs>
+          <w:tab w:val="num" w:pos="5040"/>
+        </w:tabs>
+        <w:ind w:left="5040" w:hanging="360"/>
+      </w:pPr>
+      <w:rPr>
+        <w:rFonts w:ascii="Wingdings" w:hAnsi="Wingdings" w:hint="default"/>
+        <w:sz w:val="20"/>
+      </w:rPr>
+    </w:lvl>
+    <w:lvl w:ilvl="7" w:tentative="1">
+      <w:start w:val="1"/>
+      <w:numFmt w:val="bullet"/>
+      <w:lvlText w:val=""/>
+      <w:lvlJc w:val="left"/>
+      <w:pPr>
+        <w:tabs>
+          <w:tab w:val="num" w:pos="5760"/>
+        </w:tabs>
+        <w:ind w:left="5760" w:hanging="360"/>
+      </w:pPr>
+      <w:rPr>
+        <w:rFonts w:ascii="Wingdings" w:hAnsi="Wingdings" w:hint="default"/>
+        <w:sz w:val="20"/>
+      </w:rPr>
+    </w:lvl>
+    <w:lvl w:ilvl="8" w:tentative="1">
+      <w:start w:val="1"/>
+      <w:numFmt w:val="bullet"/>
+      <w:lvlText w:val=""/>
+      <w:lvlJc w:val="left"/>
+      <w:pPr>
+        <w:tabs>
+          <w:tab w:val="num" w:pos="6480"/>
+        </w:tabs>
+        <w:ind w:left="6480" w:hanging="360"/>
+      </w:pPr>
+      <w:rPr>
+        <w:rFonts w:ascii="Wingdings" w:hAnsi="Wingdings" w:hint="default"/>
+        <w:sz w:val="20"/>
+      </w:rPr>
+    </w:lvl>
+  </w:abstractNum>
+  <w:abstractNum w:abstractNumId="1" w15:restartNumberingAfterBreak="0">
     <w:nsid w:val="37435145"/>
     <w:multiLevelType w:val="hybridMultilevel"/>
     <w:tmpl w:val="D65033C4"/>
@@ -718,7 +2177,305 @@
       </w:rPr>
     </w:lvl>
   </w:abstractNum>
-  <w:abstractNum w:abstractNumId="1" w15:restartNumberingAfterBreak="0">
+  <w:abstractNum w:abstractNumId="2" w15:restartNumberingAfterBreak="0">
+    <w:nsid w:val="4EE326C6"/>
+    <w:multiLevelType w:val="multilevel"/>
+    <w:tmpl w:val="51BCF8FC"/>
+    <w:lvl w:ilvl="0">
+      <w:start w:val="1"/>
+      <w:numFmt w:val="bullet"/>
+      <w:lvlText w:val=""/>
+      <w:lvlJc w:val="left"/>
+      <w:pPr>
+        <w:tabs>
+          <w:tab w:val="num" w:pos="720"/>
+        </w:tabs>
+        <w:ind w:left="720" w:hanging="360"/>
+      </w:pPr>
+      <w:rPr>
+        <w:rFonts w:ascii="Symbol" w:hAnsi="Symbol" w:hint="default"/>
+        <w:sz w:val="20"/>
+      </w:rPr>
+    </w:lvl>
+    <w:lvl w:ilvl="1">
+      <w:start w:val="1"/>
+      <w:numFmt w:val="bullet"/>
+      <w:lvlText w:val="o"/>
+      <w:lvlJc w:val="left"/>
+      <w:pPr>
+        <w:tabs>
+          <w:tab w:val="num" w:pos="1440"/>
+        </w:tabs>
+        <w:ind w:left="1440" w:hanging="360"/>
+      </w:pPr>
+      <w:rPr>
+        <w:rFonts w:ascii="Courier New" w:hAnsi="Courier New" w:hint="default"/>
+        <w:sz w:val="20"/>
+      </w:rPr>
+    </w:lvl>
+    <w:lvl w:ilvl="2">
+      <w:start w:val="1"/>
+      <w:numFmt w:val="bullet"/>
+      <w:lvlText w:val=""/>
+      <w:lvlJc w:val="left"/>
+      <w:pPr>
+        <w:tabs>
+          <w:tab w:val="num" w:pos="2160"/>
+        </w:tabs>
+        <w:ind w:left="2160" w:hanging="360"/>
+      </w:pPr>
+      <w:rPr>
+        <w:rFonts w:ascii="Wingdings" w:hAnsi="Wingdings" w:hint="default"/>
+        <w:sz w:val="20"/>
+      </w:rPr>
+    </w:lvl>
+    <w:lvl w:ilvl="3" w:tentative="1">
+      <w:start w:val="1"/>
+      <w:numFmt w:val="bullet"/>
+      <w:lvlText w:val=""/>
+      <w:lvlJc w:val="left"/>
+      <w:pPr>
+        <w:tabs>
+          <w:tab w:val="num" w:pos="2880"/>
+        </w:tabs>
+        <w:ind w:left="2880" w:hanging="360"/>
+      </w:pPr>
+      <w:rPr>
+        <w:rFonts w:ascii="Wingdings" w:hAnsi="Wingdings" w:hint="default"/>
+        <w:sz w:val="20"/>
+      </w:rPr>
+    </w:lvl>
+    <w:lvl w:ilvl="4" w:tentative="1">
+      <w:start w:val="1"/>
+      <w:numFmt w:val="bullet"/>
+      <w:lvlText w:val=""/>
+      <w:lvlJc w:val="left"/>
+      <w:pPr>
+        <w:tabs>
+          <w:tab w:val="num" w:pos="3600"/>
+        </w:tabs>
+        <w:ind w:left="3600" w:hanging="360"/>
+      </w:pPr>
+      <w:rPr>
+        <w:rFonts w:ascii="Wingdings" w:hAnsi="Wingdings" w:hint="default"/>
+        <w:sz w:val="20"/>
+      </w:rPr>
+    </w:lvl>
+    <w:lvl w:ilvl="5" w:tentative="1">
+      <w:start w:val="1"/>
+      <w:numFmt w:val="bullet"/>
+      <w:lvlText w:val=""/>
+      <w:lvlJc w:val="left"/>
+      <w:pPr>
+        <w:tabs>
+          <w:tab w:val="num" w:pos="4320"/>
+        </w:tabs>
+        <w:ind w:left="4320" w:hanging="360"/>
+      </w:pPr>
+      <w:rPr>
+        <w:rFonts w:ascii="Wingdings" w:hAnsi="Wingdings" w:hint="default"/>
+        <w:sz w:val="20"/>
+      </w:rPr>
+    </w:lvl>
+    <w:lvl w:ilvl="6" w:tentative="1">
+      <w:start w:val="1"/>
+      <w:numFmt w:val="bullet"/>
+      <w:lvlText w:val=""/>
+      <w:lvlJc w:val="left"/>
+      <w:pPr>
+        <w:tabs>
+          <w:tab w:val="num" w:pos="5040"/>
+        </w:tabs>
+        <w:ind w:left="5040" w:hanging="360"/>
+      </w:pPr>
+      <w:rPr>
+        <w:rFonts w:ascii="Wingdings" w:hAnsi="Wingdings" w:hint="default"/>
+        <w:sz w:val="20"/>
+      </w:rPr>
+    </w:lvl>
+    <w:lvl w:ilvl="7" w:tentative="1">
+      <w:start w:val="1"/>
+      <w:numFmt w:val="bullet"/>
+      <w:lvlText w:val=""/>
+      <w:lvlJc w:val="left"/>
+      <w:pPr>
+        <w:tabs>
+          <w:tab w:val="num" w:pos="5760"/>
+        </w:tabs>
+        <w:ind w:left="5760" w:hanging="360"/>
+      </w:pPr>
+      <w:rPr>
+        <w:rFonts w:ascii="Wingdings" w:hAnsi="Wingdings" w:hint="default"/>
+        <w:sz w:val="20"/>
+      </w:rPr>
+    </w:lvl>
+    <w:lvl w:ilvl="8" w:tentative="1">
+      <w:start w:val="1"/>
+      <w:numFmt w:val="bullet"/>
+      <w:lvlText w:val=""/>
+      <w:lvlJc w:val="left"/>
+      <w:pPr>
+        <w:tabs>
+          <w:tab w:val="num" w:pos="6480"/>
+        </w:tabs>
+        <w:ind w:left="6480" w:hanging="360"/>
+      </w:pPr>
+      <w:rPr>
+        <w:rFonts w:ascii="Wingdings" w:hAnsi="Wingdings" w:hint="default"/>
+        <w:sz w:val="20"/>
+      </w:rPr>
+    </w:lvl>
+  </w:abstractNum>
+  <w:abstractNum w:abstractNumId="3" w15:restartNumberingAfterBreak="0">
+    <w:nsid w:val="6AD07904"/>
+    <w:multiLevelType w:val="multilevel"/>
+    <w:tmpl w:val="C74C498C"/>
+    <w:lvl w:ilvl="0">
+      <w:start w:val="1"/>
+      <w:numFmt w:val="bullet"/>
+      <w:lvlText w:val=""/>
+      <w:lvlJc w:val="left"/>
+      <w:pPr>
+        <w:tabs>
+          <w:tab w:val="num" w:pos="720"/>
+        </w:tabs>
+        <w:ind w:left="720" w:hanging="360"/>
+      </w:pPr>
+      <w:rPr>
+        <w:rFonts w:ascii="Symbol" w:hAnsi="Symbol" w:hint="default"/>
+        <w:sz w:val="20"/>
+      </w:rPr>
+    </w:lvl>
+    <w:lvl w:ilvl="1">
+      <w:start w:val="1"/>
+      <w:numFmt w:val="bullet"/>
+      <w:lvlText w:val="o"/>
+      <w:lvlJc w:val="left"/>
+      <w:pPr>
+        <w:tabs>
+          <w:tab w:val="num" w:pos="1440"/>
+        </w:tabs>
+        <w:ind w:left="1440" w:hanging="360"/>
+      </w:pPr>
+      <w:rPr>
+        <w:rFonts w:ascii="Courier New" w:hAnsi="Courier New" w:hint="default"/>
+        <w:sz w:val="20"/>
+      </w:rPr>
+    </w:lvl>
+    <w:lvl w:ilvl="2" w:tentative="1">
+      <w:start w:val="1"/>
+      <w:numFmt w:val="bullet"/>
+      <w:lvlText w:val=""/>
+      <w:lvlJc w:val="left"/>
+      <w:pPr>
+        <w:tabs>
+          <w:tab w:val="num" w:pos="2160"/>
+        </w:tabs>
+        <w:ind w:left="2160" w:hanging="360"/>
+      </w:pPr>
+      <w:rPr>
+        <w:rFonts w:ascii="Wingdings" w:hAnsi="Wingdings" w:hint="default"/>
+        <w:sz w:val="20"/>
+      </w:rPr>
+    </w:lvl>
+    <w:lvl w:ilvl="3" w:tentative="1">
+      <w:start w:val="1"/>
+      <w:numFmt w:val="bullet"/>
+      <w:lvlText w:val=""/>
+      <w:lvlJc w:val="left"/>
+      <w:pPr>
+        <w:tabs>
+          <w:tab w:val="num" w:pos="2880"/>
+        </w:tabs>
+        <w:ind w:left="2880" w:hanging="360"/>
+      </w:pPr>
+      <w:rPr>
+        <w:rFonts w:ascii="Wingdings" w:hAnsi="Wingdings" w:hint="default"/>
+        <w:sz w:val="20"/>
+      </w:rPr>
+    </w:lvl>
+    <w:lvl w:ilvl="4" w:tentative="1">
+      <w:start w:val="1"/>
+      <w:numFmt w:val="bullet"/>
+      <w:lvlText w:val=""/>
+      <w:lvlJc w:val="left"/>
+      <w:pPr>
+        <w:tabs>
+          <w:tab w:val="num" w:pos="3600"/>
+        </w:tabs>
+        <w:ind w:left="3600" w:hanging="360"/>
+      </w:pPr>
+      <w:rPr>
+        <w:rFonts w:ascii="Wingdings" w:hAnsi="Wingdings" w:hint="default"/>
+        <w:sz w:val="20"/>
+      </w:rPr>
+    </w:lvl>
+    <w:lvl w:ilvl="5" w:tentative="1">
+      <w:start w:val="1"/>
+      <w:numFmt w:val="bullet"/>
+      <w:lvlText w:val=""/>
+      <w:lvlJc w:val="left"/>
+      <w:pPr>
+        <w:tabs>
+          <w:tab w:val="num" w:pos="4320"/>
+        </w:tabs>
+        <w:ind w:left="4320" w:hanging="360"/>
+      </w:pPr>
+      <w:rPr>
+        <w:rFonts w:ascii="Wingdings" w:hAnsi="Wingdings" w:hint="default"/>
+        <w:sz w:val="20"/>
+      </w:rPr>
+    </w:lvl>
+    <w:lvl w:ilvl="6" w:tentative="1">
+      <w:start w:val="1"/>
+      <w:numFmt w:val="bullet"/>
+      <w:lvlText w:val=""/>
+      <w:lvlJc w:val="left"/>
+      <w:pPr>
+        <w:tabs>
+          <w:tab w:val="num" w:pos="5040"/>
+        </w:tabs>
+        <w:ind w:left="5040" w:hanging="360"/>
+      </w:pPr>
+      <w:rPr>
+        <w:rFonts w:ascii="Wingdings" w:hAnsi="Wingdings" w:hint="default"/>
+        <w:sz w:val="20"/>
+      </w:rPr>
+    </w:lvl>
+    <w:lvl w:ilvl="7" w:tentative="1">
+      <w:start w:val="1"/>
+      <w:numFmt w:val="bullet"/>
+      <w:lvlText w:val=""/>
+      <w:lvlJc w:val="left"/>
+      <w:pPr>
+        <w:tabs>
+          <w:tab w:val="num" w:pos="5760"/>
+        </w:tabs>
+        <w:ind w:left="5760" w:hanging="360"/>
+      </w:pPr>
+      <w:rPr>
+        <w:rFonts w:ascii="Wingdings" w:hAnsi="Wingdings" w:hint="default"/>
+        <w:sz w:val="20"/>
+      </w:rPr>
+    </w:lvl>
+    <w:lvl w:ilvl="8" w:tentative="1">
+      <w:start w:val="1"/>
+      <w:numFmt w:val="bullet"/>
+      <w:lvlText w:val=""/>
+      <w:lvlJc w:val="left"/>
+      <w:pPr>
+        <w:tabs>
+          <w:tab w:val="num" w:pos="6480"/>
+        </w:tabs>
+        <w:ind w:left="6480" w:hanging="360"/>
+      </w:pPr>
+      <w:rPr>
+        <w:rFonts w:ascii="Wingdings" w:hAnsi="Wingdings" w:hint="default"/>
+        <w:sz w:val="20"/>
+      </w:rPr>
+    </w:lvl>
+  </w:abstractNum>
+  <w:abstractNum w:abstractNumId="4" w15:restartNumberingAfterBreak="0">
     <w:nsid w:val="6B04363F"/>
     <w:multiLevelType w:val="hybridMultilevel"/>
     <w:tmpl w:val="C4E068C6"/>
@@ -757,7 +2514,7 @@
         <w:rFonts w:ascii="Wingdings" w:hAnsi="Wingdings" w:hint="default"/>
       </w:rPr>
     </w:lvl>
-    <w:lvl w:ilvl="3" w:tplc="04090001" w:tentative="1">
+    <w:lvl w:ilvl="3" w:tplc="04090001">
       <w:start w:val="1"/>
       <w:numFmt w:val="bullet"/>
       <w:lvlText w:val=""/>
@@ -769,7 +2526,7 @@
         <w:rFonts w:ascii="Symbol" w:hAnsi="Symbol" w:hint="default"/>
       </w:rPr>
     </w:lvl>
-    <w:lvl w:ilvl="4" w:tplc="04090003" w:tentative="1">
+    <w:lvl w:ilvl="4" w:tplc="04090003">
       <w:start w:val="1"/>
       <w:numFmt w:val="bullet"/>
       <w:lvlText w:val="o"/>
@@ -831,10 +2588,19 @@
     </w:lvl>
   </w:abstractNum>
   <w:num w:numId="1" w16cid:durableId="1865090966">
-    <w:abstractNumId w:val="0"/>
+    <w:abstractNumId w:val="1"/>
   </w:num>
   <w:num w:numId="2" w16cid:durableId="1216816174">
-    <w:abstractNumId w:val="1"/>
+    <w:abstractNumId w:val="4"/>
+  </w:num>
+  <w:num w:numId="3" w16cid:durableId="2108454373">
+    <w:abstractNumId w:val="3"/>
+  </w:num>
+  <w:num w:numId="4" w16cid:durableId="1039433681">
+    <w:abstractNumId w:val="2"/>
+  </w:num>
+  <w:num w:numId="5" w16cid:durableId="1487548499">
+    <w:abstractNumId w:val="0"/>
   </w:num>
 </w:numbering>
 </file>

</xml_diff>

<commit_message>
Add full SDU Phase 2 food delivery simulation project
</commit_message>
<xml_diff>
--- a/exercise and report/Notes Phase 2.docx
+++ b/exercise and report/Notes Phase 2.docx
@@ -389,21 +389,7 @@
         <w:rPr>
           <w:lang w:val="en-US"/>
         </w:rPr>
-        <w:t xml:space="preserve">4) per offer: driver accepts or rejects (based on </w:t>
-      </w:r>
-      <w:proofErr w:type="spellStart"/>
-      <w:r>
-        <w:rPr>
-          <w:lang w:val="en-US"/>
-        </w:rPr>
-        <w:t>behaviour</w:t>
-      </w:r>
-      <w:proofErr w:type="spellEnd"/>
-      <w:r>
-        <w:rPr>
-          <w:lang w:val="en-US"/>
-        </w:rPr>
-        <w:t>)</w:t>
+        <w:t>4) per offer: driver accepts or rejects (based on behaviour)</w:t>
       </w:r>
     </w:p>
     <w:p>
@@ -439,21 +425,7 @@
         <w:rPr>
           <w:lang w:val="en-US"/>
         </w:rPr>
-        <w:t xml:space="preserve">6) Drivers move (according to their assignment – to pickup or </w:t>
-      </w:r>
-      <w:proofErr w:type="spellStart"/>
-      <w:r>
-        <w:rPr>
-          <w:lang w:val="en-US"/>
-        </w:rPr>
-        <w:t>dorp</w:t>
-      </w:r>
-      <w:proofErr w:type="spellEnd"/>
-      <w:r>
-        <w:rPr>
-          <w:lang w:val="en-US"/>
-        </w:rPr>
-        <w:t xml:space="preserve"> off)</w:t>
+        <w:t>6) Drivers move (according to their assignment – to pickup or dorp off)</w:t>
       </w:r>
     </w:p>
     <w:p>
@@ -477,21 +449,7 @@
         <w:rPr>
           <w:lang w:val="en-US"/>
         </w:rPr>
-        <w:t>If driver reaches pickup/</w:t>
-      </w:r>
-      <w:proofErr w:type="spellStart"/>
-      <w:r>
-        <w:rPr>
-          <w:lang w:val="en-US"/>
-        </w:rPr>
-        <w:t>dropoff</w:t>
-      </w:r>
-      <w:proofErr w:type="spellEnd"/>
-      <w:r>
-        <w:rPr>
-          <w:lang w:val="en-US"/>
-        </w:rPr>
-        <w:t>: request &amp; driver state updated + global statistics collected</w:t>
+        <w:t>If driver reaches pickup/dropoff: request &amp; driver state updated + global statistics collected</w:t>
       </w:r>
     </w:p>
     <w:p>
@@ -509,21 +467,7 @@
         <w:rPr>
           <w:lang w:val="en-US"/>
         </w:rPr>
-        <w:t xml:space="preserve">8) per driver: mutation rule – may change </w:t>
-      </w:r>
-      <w:proofErr w:type="spellStart"/>
-      <w:r>
-        <w:rPr>
-          <w:lang w:val="en-US"/>
-        </w:rPr>
-        <w:t>behaviour</w:t>
-      </w:r>
-      <w:proofErr w:type="spellEnd"/>
-      <w:r>
-        <w:rPr>
-          <w:lang w:val="en-US"/>
-        </w:rPr>
-        <w:t xml:space="preserve"> based on performance</w:t>
+        <w:t>8) per driver: mutation rule – may change behaviour based on performance</w:t>
       </w:r>
     </w:p>
     <w:p>
@@ -577,21 +521,7 @@
         <w:rPr>
           <w:lang w:val="en-US"/>
         </w:rPr>
-        <w:t xml:space="preserve">How to collaborate – </w:t>
-      </w:r>
-      <w:proofErr w:type="spellStart"/>
-      <w:r>
-        <w:rPr>
-          <w:lang w:val="en-US"/>
-        </w:rPr>
-        <w:t>Github</w:t>
-      </w:r>
-      <w:proofErr w:type="spellEnd"/>
-      <w:r>
-        <w:rPr>
-          <w:lang w:val="en-US"/>
-        </w:rPr>
-        <w:t>?</w:t>
+        <w:t>How to collaborate – Github?</w:t>
       </w:r>
       <w:r>
         <w:rPr>
@@ -716,29 +646,16 @@
           <w14:ligatures w14:val="none"/>
         </w:rPr>
       </w:pPr>
-      <w:proofErr w:type="spellStart"/>
-      <w:r>
-        <w:rPr>
-          <w:rFonts w:ascii="Segoe UI" w:eastAsia="Times New Roman" w:hAnsi="Segoe UI" w:cs="Segoe UI"/>
-          <w:kern w:val="0"/>
-          <w:sz w:val="24"/>
-          <w:szCs w:val="24"/>
-          <w:lang w:val="en-US"/>
-          <w14:ligatures w14:val="none"/>
-        </w:rPr>
-        <w:t>DeliverySimulation</w:t>
-      </w:r>
-      <w:proofErr w:type="spellEnd"/>
-      <w:r>
-        <w:rPr>
-          <w:rFonts w:ascii="Segoe UI" w:eastAsia="Times New Roman" w:hAnsi="Segoe UI" w:cs="Segoe UI"/>
-          <w:kern w:val="0"/>
-          <w:sz w:val="24"/>
-          <w:szCs w:val="24"/>
-          <w:lang w:val="en-US"/>
-          <w14:ligatures w14:val="none"/>
-        </w:rPr>
-        <w:t>:</w:t>
+      <w:r>
+        <w:rPr>
+          <w:rFonts w:ascii="Segoe UI" w:eastAsia="Times New Roman" w:hAnsi="Segoe UI" w:cs="Segoe UI"/>
+          <w:kern w:val="0"/>
+          <w:sz w:val="24"/>
+          <w:szCs w:val="24"/>
+          <w:lang w:val="en-US"/>
+          <w14:ligatures w14:val="none"/>
+        </w:rPr>
+        <w:t>DeliverySimulation:</w:t>
       </w:r>
     </w:p>
     <w:p>
@@ -785,29 +702,16 @@
           <w14:ligatures w14:val="none"/>
         </w:rPr>
       </w:pPr>
-      <w:proofErr w:type="spellStart"/>
-      <w:r>
-        <w:rPr>
-          <w:rFonts w:ascii="Segoe UI" w:eastAsia="Times New Roman" w:hAnsi="Segoe UI" w:cs="Segoe UI"/>
-          <w:kern w:val="0"/>
-          <w:sz w:val="24"/>
-          <w:szCs w:val="24"/>
-          <w:lang w:val="en-US"/>
-          <w14:ligatures w14:val="none"/>
-        </w:rPr>
-        <w:t>get_snapshot</w:t>
-      </w:r>
-      <w:proofErr w:type="spellEnd"/>
-      <w:r>
-        <w:rPr>
-          <w:rFonts w:ascii="Segoe UI" w:eastAsia="Times New Roman" w:hAnsi="Segoe UI" w:cs="Segoe UI"/>
-          <w:kern w:val="0"/>
-          <w:sz w:val="24"/>
-          <w:szCs w:val="24"/>
-          <w:lang w:val="en-US"/>
-          <w14:ligatures w14:val="none"/>
-        </w:rPr>
-        <w:t>() for the GUI adapter.</w:t>
+      <w:r>
+        <w:rPr>
+          <w:rFonts w:ascii="Segoe UI" w:eastAsia="Times New Roman" w:hAnsi="Segoe UI" w:cs="Segoe UI"/>
+          <w:kern w:val="0"/>
+          <w:sz w:val="24"/>
+          <w:szCs w:val="24"/>
+          <w:lang w:val="en-US"/>
+          <w14:ligatures w14:val="none"/>
+        </w:rPr>
+        <w:t>get_snapshot() for the GUI adapter.</w:t>
       </w:r>
     </w:p>
     <w:p>
@@ -854,29 +758,16 @@
           <w14:ligatures w14:val="none"/>
         </w:rPr>
       </w:pPr>
-      <w:proofErr w:type="spellStart"/>
-      <w:r>
-        <w:rPr>
-          <w:rFonts w:ascii="Segoe UI" w:eastAsia="Times New Roman" w:hAnsi="Segoe UI" w:cs="Segoe UI"/>
-          <w:kern w:val="0"/>
-          <w:sz w:val="24"/>
-          <w:szCs w:val="24"/>
-          <w:lang w:val="en-US"/>
-          <w14:ligatures w14:val="none"/>
-        </w:rPr>
-        <w:t>init_simulation</w:t>
-      </w:r>
-      <w:proofErr w:type="spellEnd"/>
-      <w:r>
-        <w:rPr>
-          <w:rFonts w:ascii="Segoe UI" w:eastAsia="Times New Roman" w:hAnsi="Segoe UI" w:cs="Segoe UI"/>
-          <w:kern w:val="0"/>
-          <w:sz w:val="24"/>
-          <w:szCs w:val="24"/>
-          <w:lang w:val="en-US"/>
-          <w14:ligatures w14:val="none"/>
-        </w:rPr>
-        <w:t>(...)</w:t>
+      <w:r>
+        <w:rPr>
+          <w:rFonts w:ascii="Segoe UI" w:eastAsia="Times New Roman" w:hAnsi="Segoe UI" w:cs="Segoe UI"/>
+          <w:kern w:val="0"/>
+          <w:sz w:val="24"/>
+          <w:szCs w:val="24"/>
+          <w:lang w:val="en-US"/>
+          <w14:ligatures w14:val="none"/>
+        </w:rPr>
+        <w:t>init_simulation(...)</w:t>
       </w:r>
     </w:p>
     <w:p>
@@ -895,53 +786,16 @@
           <w14:ligatures w14:val="none"/>
         </w:rPr>
       </w:pPr>
-      <w:proofErr w:type="spellStart"/>
-      <w:r>
-        <w:rPr>
-          <w:rFonts w:ascii="Segoe UI" w:eastAsia="Times New Roman" w:hAnsi="Segoe UI" w:cs="Segoe UI"/>
-          <w:kern w:val="0"/>
-          <w:sz w:val="24"/>
-          <w:szCs w:val="24"/>
-          <w:lang w:val="en-US"/>
-          <w14:ligatures w14:val="none"/>
-        </w:rPr>
-        <w:t>step_simulation</w:t>
-      </w:r>
-      <w:proofErr w:type="spellEnd"/>
-      <w:r>
-        <w:rPr>
-          <w:rFonts w:ascii="Segoe UI" w:eastAsia="Times New Roman" w:hAnsi="Segoe UI" w:cs="Segoe UI"/>
-          <w:kern w:val="0"/>
-          <w:sz w:val="24"/>
-          <w:szCs w:val="24"/>
-          <w:lang w:val="en-US"/>
-          <w14:ligatures w14:val="none"/>
-        </w:rPr>
-        <w:t xml:space="preserve">() -&gt; (time, metrics </w:t>
-      </w:r>
-      <w:proofErr w:type="spellStart"/>
-      <w:r>
-        <w:rPr>
-          <w:rFonts w:ascii="Segoe UI" w:eastAsia="Times New Roman" w:hAnsi="Segoe UI" w:cs="Segoe UI"/>
-          <w:kern w:val="0"/>
-          <w:sz w:val="24"/>
-          <w:szCs w:val="24"/>
-          <w:lang w:val="en-US"/>
-          <w14:ligatures w14:val="none"/>
-        </w:rPr>
-        <w:t>dict</w:t>
-      </w:r>
-      <w:proofErr w:type="spellEnd"/>
-      <w:r>
-        <w:rPr>
-          <w:rFonts w:ascii="Segoe UI" w:eastAsia="Times New Roman" w:hAnsi="Segoe UI" w:cs="Segoe UI"/>
-          <w:kern w:val="0"/>
-          <w:sz w:val="24"/>
-          <w:szCs w:val="24"/>
-          <w:lang w:val="en-US"/>
-          <w14:ligatures w14:val="none"/>
-        </w:rPr>
-        <w:t>)</w:t>
+      <w:r>
+        <w:rPr>
+          <w:rFonts w:ascii="Segoe UI" w:eastAsia="Times New Roman" w:hAnsi="Segoe UI" w:cs="Segoe UI"/>
+          <w:kern w:val="0"/>
+          <w:sz w:val="24"/>
+          <w:szCs w:val="24"/>
+          <w:lang w:val="en-US"/>
+          <w14:ligatures w14:val="none"/>
+        </w:rPr>
+        <w:t>step_simulation() -&gt; (time, metrics dict)</w:t>
       </w:r>
     </w:p>
     <w:p>
@@ -960,29 +814,16 @@
           <w14:ligatures w14:val="none"/>
         </w:rPr>
       </w:pPr>
-      <w:proofErr w:type="spellStart"/>
-      <w:r>
-        <w:rPr>
-          <w:rFonts w:ascii="Segoe UI" w:eastAsia="Times New Roman" w:hAnsi="Segoe UI" w:cs="Segoe UI"/>
-          <w:kern w:val="0"/>
-          <w:sz w:val="24"/>
-          <w:szCs w:val="24"/>
-          <w:lang w:val="en-US"/>
-          <w14:ligatures w14:val="none"/>
-        </w:rPr>
-        <w:t>get_plot_data</w:t>
-      </w:r>
-      <w:proofErr w:type="spellEnd"/>
-      <w:r>
-        <w:rPr>
-          <w:rFonts w:ascii="Segoe UI" w:eastAsia="Times New Roman" w:hAnsi="Segoe UI" w:cs="Segoe UI"/>
-          <w:kern w:val="0"/>
-          <w:sz w:val="24"/>
-          <w:szCs w:val="24"/>
-          <w:lang w:val="en-US"/>
-          <w14:ligatures w14:val="none"/>
-        </w:rPr>
-        <w:t>()</w:t>
+      <w:r>
+        <w:rPr>
+          <w:rFonts w:ascii="Segoe UI" w:eastAsia="Times New Roman" w:hAnsi="Segoe UI" w:cs="Segoe UI"/>
+          <w:kern w:val="0"/>
+          <w:sz w:val="24"/>
+          <w:szCs w:val="24"/>
+          <w:lang w:val="en-US"/>
+          <w14:ligatures w14:val="none"/>
+        </w:rPr>
+        <w:t>get_plot_data()</w:t>
       </w:r>
     </w:p>
     <w:p>
@@ -1038,31 +879,7 @@
           <w:lang w:val="en-US"/>
           <w14:ligatures w14:val="none"/>
         </w:rPr>
-        <w:t xml:space="preserve">metrics over time (served, expired, </w:t>
-      </w:r>
-      <w:proofErr w:type="spellStart"/>
-      <w:r>
-        <w:rPr>
-          <w:rFonts w:ascii="Segoe UI" w:eastAsia="Times New Roman" w:hAnsi="Segoe UI" w:cs="Segoe UI"/>
-          <w:kern w:val="0"/>
-          <w:sz w:val="24"/>
-          <w:szCs w:val="24"/>
-          <w:lang w:val="en-US"/>
-          <w14:ligatures w14:val="none"/>
-        </w:rPr>
-        <w:t>avg_wait</w:t>
-      </w:r>
-      <w:proofErr w:type="spellEnd"/>
-      <w:r>
-        <w:rPr>
-          <w:rFonts w:ascii="Segoe UI" w:eastAsia="Times New Roman" w:hAnsi="Segoe UI" w:cs="Segoe UI"/>
-          <w:kern w:val="0"/>
-          <w:sz w:val="24"/>
-          <w:szCs w:val="24"/>
-          <w:lang w:val="en-US"/>
-          <w14:ligatures w14:val="none"/>
-        </w:rPr>
-        <w:t>, maybe earnings).</w:t>
+        <w:t>metrics over time (served, expired, avg_wait, maybe earnings).</w:t>
       </w:r>
     </w:p>
     <w:p>
@@ -1230,29 +1047,16 @@
           <w14:ligatures w14:val="none"/>
         </w:rPr>
       </w:pPr>
-      <w:proofErr w:type="spellStart"/>
-      <w:r>
-        <w:rPr>
-          <w:rFonts w:ascii="Segoe UI" w:eastAsia="Times New Roman" w:hAnsi="Segoe UI" w:cs="Segoe UI"/>
-          <w:kern w:val="0"/>
-          <w:sz w:val="24"/>
-          <w:szCs w:val="24"/>
-          <w:lang w:val="en-US"/>
-          <w14:ligatures w14:val="none"/>
-        </w:rPr>
-        <w:t>DispatchPolicy</w:t>
-      </w:r>
-      <w:proofErr w:type="spellEnd"/>
-      <w:r>
-        <w:rPr>
-          <w:rFonts w:ascii="Segoe UI" w:eastAsia="Times New Roman" w:hAnsi="Segoe UI" w:cs="Segoe UI"/>
-          <w:kern w:val="0"/>
-          <w:sz w:val="24"/>
-          <w:szCs w:val="24"/>
-          <w:lang w:val="en-US"/>
-          <w14:ligatures w14:val="none"/>
-        </w:rPr>
-        <w:t xml:space="preserve"> base +:</w:t>
+      <w:r>
+        <w:rPr>
+          <w:rFonts w:ascii="Segoe UI" w:eastAsia="Times New Roman" w:hAnsi="Segoe UI" w:cs="Segoe UI"/>
+          <w:kern w:val="0"/>
+          <w:sz w:val="24"/>
+          <w:szCs w:val="24"/>
+          <w:lang w:val="en-US"/>
+          <w14:ligatures w14:val="none"/>
+        </w:rPr>
+        <w:t>DispatchPolicy base +:</w:t>
       </w:r>
     </w:p>
     <w:p>
@@ -1271,7 +1075,6 @@
           <w14:ligatures w14:val="none"/>
         </w:rPr>
       </w:pPr>
-      <w:proofErr w:type="spellStart"/>
       <w:r>
         <w:rPr>
           <w:rFonts w:ascii="Segoe UI" w:eastAsia="Times New Roman" w:hAnsi="Segoe UI" w:cs="Segoe UI"/>
@@ -1283,7 +1086,6 @@
         </w:rPr>
         <w:t>NearestNeighborPolicy</w:t>
       </w:r>
-      <w:proofErr w:type="spellEnd"/>
     </w:p>
     <w:p>
       <w:pPr>
@@ -1301,7 +1103,6 @@
           <w14:ligatures w14:val="none"/>
         </w:rPr>
       </w:pPr>
-      <w:proofErr w:type="spellStart"/>
       <w:r>
         <w:rPr>
           <w:rFonts w:ascii="Segoe UI" w:eastAsia="Times New Roman" w:hAnsi="Segoe UI" w:cs="Segoe UI"/>
@@ -1313,7 +1114,6 @@
         </w:rPr>
         <w:t>GlobalGreedyPolicy</w:t>
       </w:r>
-      <w:proofErr w:type="spellEnd"/>
     </w:p>
     <w:p>
       <w:pPr>
@@ -1359,29 +1159,16 @@
           <w14:ligatures w14:val="none"/>
         </w:rPr>
       </w:pPr>
-      <w:proofErr w:type="spellStart"/>
-      <w:r>
-        <w:rPr>
-          <w:rFonts w:ascii="Segoe UI" w:eastAsia="Times New Roman" w:hAnsi="Segoe UI" w:cs="Segoe UI"/>
-          <w:kern w:val="0"/>
-          <w:sz w:val="24"/>
-          <w:szCs w:val="24"/>
-          <w:lang w:val="en-US"/>
-          <w14:ligatures w14:val="none"/>
-        </w:rPr>
-        <w:t>DriverBehaviour</w:t>
-      </w:r>
-      <w:proofErr w:type="spellEnd"/>
-      <w:r>
-        <w:rPr>
-          <w:rFonts w:ascii="Segoe UI" w:eastAsia="Times New Roman" w:hAnsi="Segoe UI" w:cs="Segoe UI"/>
-          <w:kern w:val="0"/>
-          <w:sz w:val="24"/>
-          <w:szCs w:val="24"/>
-          <w:lang w:val="en-US"/>
-          <w14:ligatures w14:val="none"/>
-        </w:rPr>
-        <w:t xml:space="preserve"> base + at least 2 implementations:</w:t>
+      <w:r>
+        <w:rPr>
+          <w:rFonts w:ascii="Segoe UI" w:eastAsia="Times New Roman" w:hAnsi="Segoe UI" w:cs="Segoe UI"/>
+          <w:kern w:val="0"/>
+          <w:sz w:val="24"/>
+          <w:szCs w:val="24"/>
+          <w:lang w:val="en-US"/>
+          <w14:ligatures w14:val="none"/>
+        </w:rPr>
+        <w:t>DriverBehaviour base + at least 2 implementations:</w:t>
       </w:r>
     </w:p>
     <w:p>
@@ -1409,79 +1196,7 @@
           <w:lang w:val="en-US"/>
           <w14:ligatures w14:val="none"/>
         </w:rPr>
-        <w:t xml:space="preserve">e.g. </w:t>
-      </w:r>
-      <w:proofErr w:type="spellStart"/>
-      <w:r>
-        <w:rPr>
-          <w:rFonts w:ascii="Segoe UI" w:eastAsia="Times New Roman" w:hAnsi="Segoe UI" w:cs="Segoe UI"/>
-          <w:kern w:val="0"/>
-          <w:sz w:val="24"/>
-          <w:szCs w:val="24"/>
-          <w:lang w:val="en-US"/>
-          <w14:ligatures w14:val="none"/>
-        </w:rPr>
-        <w:t>GreedyDistanceBehaviour</w:t>
-      </w:r>
-      <w:proofErr w:type="spellEnd"/>
-      <w:r>
-        <w:rPr>
-          <w:rFonts w:ascii="Segoe UI" w:eastAsia="Times New Roman" w:hAnsi="Segoe UI" w:cs="Segoe UI"/>
-          <w:kern w:val="0"/>
-          <w:sz w:val="24"/>
-          <w:szCs w:val="24"/>
-          <w:lang w:val="en-US"/>
-          <w14:ligatures w14:val="none"/>
-        </w:rPr>
-        <w:t xml:space="preserve">, </w:t>
-      </w:r>
-      <w:proofErr w:type="spellStart"/>
-      <w:r>
-        <w:rPr>
-          <w:rFonts w:ascii="Segoe UI" w:eastAsia="Times New Roman" w:hAnsi="Segoe UI" w:cs="Segoe UI"/>
-          <w:kern w:val="0"/>
-          <w:sz w:val="24"/>
-          <w:szCs w:val="24"/>
-          <w:lang w:val="en-US"/>
-          <w14:ligatures w14:val="none"/>
-        </w:rPr>
-        <w:t>EarningsMaxBehaviour</w:t>
-      </w:r>
-      <w:proofErr w:type="spellEnd"/>
-      <w:r>
-        <w:rPr>
-          <w:rFonts w:ascii="Segoe UI" w:eastAsia="Times New Roman" w:hAnsi="Segoe UI" w:cs="Segoe UI"/>
-          <w:kern w:val="0"/>
-          <w:sz w:val="24"/>
-          <w:szCs w:val="24"/>
-          <w:lang w:val="en-US"/>
-          <w14:ligatures w14:val="none"/>
-        </w:rPr>
-        <w:t xml:space="preserve">, </w:t>
-      </w:r>
-      <w:proofErr w:type="spellStart"/>
-      <w:r>
-        <w:rPr>
-          <w:rFonts w:ascii="Segoe UI" w:eastAsia="Times New Roman" w:hAnsi="Segoe UI" w:cs="Segoe UI"/>
-          <w:kern w:val="0"/>
-          <w:sz w:val="24"/>
-          <w:szCs w:val="24"/>
-          <w:lang w:val="en-US"/>
-          <w14:ligatures w14:val="none"/>
-        </w:rPr>
-        <w:t>LazyBehaviour</w:t>
-      </w:r>
-      <w:proofErr w:type="spellEnd"/>
-      <w:r>
-        <w:rPr>
-          <w:rFonts w:ascii="Segoe UI" w:eastAsia="Times New Roman" w:hAnsi="Segoe UI" w:cs="Segoe UI"/>
-          <w:kern w:val="0"/>
-          <w:sz w:val="24"/>
-          <w:szCs w:val="24"/>
-          <w:lang w:val="en-US"/>
-          <w14:ligatures w14:val="none"/>
-        </w:rPr>
-        <w:t>.</w:t>
+        <w:t>e.g. GreedyDistanceBehaviour, EarningsMaxBehaviour, LazyBehaviour.</w:t>
       </w:r>
     </w:p>
     <w:p>
@@ -1500,29 +1215,16 @@
           <w14:ligatures w14:val="none"/>
         </w:rPr>
       </w:pPr>
-      <w:proofErr w:type="spellStart"/>
-      <w:r>
-        <w:rPr>
-          <w:rFonts w:ascii="Segoe UI" w:eastAsia="Times New Roman" w:hAnsi="Segoe UI" w:cs="Segoe UI"/>
-          <w:kern w:val="0"/>
-          <w:sz w:val="24"/>
-          <w:szCs w:val="24"/>
-          <w:lang w:val="en-US"/>
-          <w14:ligatures w14:val="none"/>
-        </w:rPr>
-        <w:t>MutationRule</w:t>
-      </w:r>
-      <w:proofErr w:type="spellEnd"/>
-      <w:r>
-        <w:rPr>
-          <w:rFonts w:ascii="Segoe UI" w:eastAsia="Times New Roman" w:hAnsi="Segoe UI" w:cs="Segoe UI"/>
-          <w:kern w:val="0"/>
-          <w:sz w:val="24"/>
-          <w:szCs w:val="24"/>
-          <w:lang w:val="en-US"/>
-          <w14:ligatures w14:val="none"/>
-        </w:rPr>
-        <w:t xml:space="preserve"> (+ one non-trivial rule).</w:t>
+      <w:r>
+        <w:rPr>
+          <w:rFonts w:ascii="Segoe UI" w:eastAsia="Times New Roman" w:hAnsi="Segoe UI" w:cs="Segoe UI"/>
+          <w:kern w:val="0"/>
+          <w:sz w:val="24"/>
+          <w:szCs w:val="24"/>
+          <w:lang w:val="en-US"/>
+          <w14:ligatures w14:val="none"/>
+        </w:rPr>
+        <w:t>MutationRule (+ one non-trivial rule).</w:t>
       </w:r>
     </w:p>
     <w:p>
@@ -1606,31 +1308,7 @@
           <w:lang w:val="en-US"/>
           <w14:ligatures w14:val="none"/>
         </w:rPr>
-        <w:t xml:space="preserve">Check that </w:t>
-      </w:r>
-      <w:proofErr w:type="spellStart"/>
-      <w:r>
-        <w:rPr>
-          <w:rFonts w:ascii="Segoe UI" w:eastAsia="Times New Roman" w:hAnsi="Segoe UI" w:cs="Segoe UI"/>
-          <w:kern w:val="0"/>
-          <w:sz w:val="24"/>
-          <w:szCs w:val="24"/>
-          <w:lang w:val="en-US"/>
-          <w14:ligatures w14:val="none"/>
-        </w:rPr>
-        <w:t>behaviours</w:t>
-      </w:r>
-      <w:proofErr w:type="spellEnd"/>
-      <w:r>
-        <w:rPr>
-          <w:rFonts w:ascii="Segoe UI" w:eastAsia="Times New Roman" w:hAnsi="Segoe UI" w:cs="Segoe UI"/>
-          <w:kern w:val="0"/>
-          <w:sz w:val="24"/>
-          <w:szCs w:val="24"/>
-          <w:lang w:val="en-US"/>
-          <w14:ligatures w14:val="none"/>
-        </w:rPr>
-        <w:t xml:space="preserve"> accept/reject as expected.</w:t>
+        <w:t>Check that behaviours accept/reject as expected.</w:t>
       </w:r>
     </w:p>
     <w:p>
@@ -1658,31 +1336,7 @@
           <w:lang w:val="en-US"/>
           <w14:ligatures w14:val="none"/>
         </w:rPr>
-        <w:t xml:space="preserve">Check that mutation actually changes </w:t>
-      </w:r>
-      <w:proofErr w:type="spellStart"/>
-      <w:r>
-        <w:rPr>
-          <w:rFonts w:ascii="Segoe UI" w:eastAsia="Times New Roman" w:hAnsi="Segoe UI" w:cs="Segoe UI"/>
-          <w:kern w:val="0"/>
-          <w:sz w:val="24"/>
-          <w:szCs w:val="24"/>
-          <w:lang w:val="en-US"/>
-          <w14:ligatures w14:val="none"/>
-        </w:rPr>
-        <w:t>behaviour</w:t>
-      </w:r>
-      <w:proofErr w:type="spellEnd"/>
-      <w:r>
-        <w:rPr>
-          <w:rFonts w:ascii="Segoe UI" w:eastAsia="Times New Roman" w:hAnsi="Segoe UI" w:cs="Segoe UI"/>
-          <w:kern w:val="0"/>
-          <w:sz w:val="24"/>
-          <w:szCs w:val="24"/>
-          <w:lang w:val="en-US"/>
-          <w14:ligatures w14:val="none"/>
-        </w:rPr>
-        <w:t xml:space="preserve"> at runtime.</w:t>
+        <w:t>Check that mutation actually changes behaviour at runtime.</w:t>
       </w:r>
     </w:p>
     <w:p>
@@ -1754,21 +1408,7 @@
         <w:rPr>
           <w:lang w:val="en-US"/>
         </w:rPr>
-        <w:t xml:space="preserve">Point (with all the magic methods, </w:t>
-      </w:r>
-      <w:proofErr w:type="spellStart"/>
-      <w:r>
-        <w:rPr>
-          <w:lang w:val="en-US"/>
-        </w:rPr>
-        <w:t>distance_to</w:t>
-      </w:r>
-      <w:proofErr w:type="spellEnd"/>
-      <w:r>
-        <w:rPr>
-          <w:lang w:val="en-US"/>
-        </w:rPr>
-        <w:t>)</w:t>
+        <w:t>Point (with all the magic methods, distance_to)</w:t>
       </w:r>
     </w:p>
     <w:p>
@@ -1836,14 +1476,12 @@
           <w:lang w:val="en-US"/>
         </w:rPr>
       </w:pPr>
-      <w:proofErr w:type="spellStart"/>
       <w:r>
         <w:rPr>
           <w:lang w:val="en-US"/>
         </w:rPr>
         <w:t>RequestGenerator.maybe_generate</w:t>
       </w:r>
-      <w:proofErr w:type="spellEnd"/>
     </w:p>
     <w:p>
       <w:pPr>
@@ -1878,22 +1516,118 @@
         <w:rPr>
           <w:lang w:val="en-US"/>
         </w:rPr>
-        <w:t xml:space="preserve">Make sure types, </w:t>
-      </w:r>
-      <w:proofErr w:type="spellStart"/>
-      <w:r>
-        <w:rPr>
-          <w:lang w:val="en-US"/>
-        </w:rPr>
-        <w:t>enums</w:t>
-      </w:r>
-      <w:proofErr w:type="spellEnd"/>
-      <w:r>
-        <w:rPr>
-          <w:lang w:val="en-US"/>
-        </w:rPr>
-        <w:t>/strings for statuses etc. are consistent.</w:t>
-      </w:r>
+        <w:t>Make sure types, enums/strings for statuses etc. are consistent.</w:t>
+      </w:r>
+    </w:p>
+    <w:p>
+      <w:pPr>
+        <w:rPr>
+          <w:lang w:val="en-US"/>
+        </w:rPr>
+      </w:pPr>
+    </w:p>
+    <w:p>
+      <w:pPr>
+        <w:pStyle w:val="ListParagraph"/>
+        <w:numPr>
+          <w:ilvl w:val="0"/>
+          <w:numId w:val="6"/>
+        </w:numPr>
+      </w:pPr>
+      <w:r>
+        <w:t>Who did what?</w:t>
+      </w:r>
+    </w:p>
+    <w:p>
+      <w:pPr>
+        <w:pStyle w:val="ListParagraph"/>
+        <w:numPr>
+          <w:ilvl w:val="1"/>
+          <w:numId w:val="6"/>
+        </w:numPr>
+      </w:pPr>
+      <w:r>
+        <w:t>Where is my part?</w:t>
+      </w:r>
+    </w:p>
+    <w:p>
+      <w:pPr>
+        <w:pStyle w:val="ListParagraph"/>
+        <w:numPr>
+          <w:ilvl w:val="0"/>
+          <w:numId w:val="6"/>
+        </w:numPr>
+        <w:rPr>
+          <w:lang w:val="en-US"/>
+        </w:rPr>
+      </w:pPr>
+      <w:r>
+        <w:rPr>
+          <w:lang w:val="en-US"/>
+        </w:rPr>
+        <w:t>Where is the phase 2 file?</w:t>
+      </w:r>
+    </w:p>
+    <w:p>
+      <w:pPr>
+        <w:pStyle w:val="ListParagraph"/>
+        <w:numPr>
+          <w:ilvl w:val="0"/>
+          <w:numId w:val="6"/>
+        </w:numPr>
+        <w:rPr>
+          <w:lang w:val="en-US"/>
+        </w:rPr>
+      </w:pPr>
+      <w:r>
+        <w:rPr>
+          <w:lang w:val="en-US"/>
+        </w:rPr>
+        <w:t>Where is my part?</w:t>
+      </w:r>
+    </w:p>
+    <w:p>
+      <w:pPr>
+        <w:pStyle w:val="ListParagraph"/>
+        <w:numPr>
+          <w:ilvl w:val="0"/>
+          <w:numId w:val="6"/>
+        </w:numPr>
+        <w:rPr>
+          <w:lang w:val="en-US"/>
+        </w:rPr>
+      </w:pPr>
+      <w:r>
+        <w:rPr>
+          <w:lang w:val="en-US"/>
+        </w:rPr>
+        <w:t>Who writes the report</w:t>
+      </w:r>
+    </w:p>
+    <w:p>
+      <w:pPr>
+        <w:pStyle w:val="ListParagraph"/>
+        <w:numPr>
+          <w:ilvl w:val="0"/>
+          <w:numId w:val="6"/>
+        </w:numPr>
+        <w:rPr>
+          <w:lang w:val="en-US"/>
+        </w:rPr>
+      </w:pPr>
+      <w:r>
+        <w:rPr>
+          <w:lang w:val="en-US"/>
+        </w:rPr>
+        <w:t xml:space="preserve">Then: I read exercise again and see if everything fits. </w:t>
+      </w:r>
+    </w:p>
+    <w:p>
+      <w:pPr>
+        <w:rPr>
+          <w:lang w:val="en-US"/>
+        </w:rPr>
+      </w:pPr>
     </w:p>
     <w:p>
       <w:pPr>
@@ -2178,6 +1912,118 @@
     </w:lvl>
   </w:abstractNum>
   <w:abstractNum w:abstractNumId="2" w15:restartNumberingAfterBreak="0">
+    <w:nsid w:val="44B942B0"/>
+    <w:multiLevelType w:val="hybridMultilevel"/>
+    <w:tmpl w:val="DAD2233C"/>
+    <w:lvl w:ilvl="0" w:tplc="57081FAE">
+      <w:numFmt w:val="bullet"/>
+      <w:lvlText w:val="-"/>
+      <w:lvlJc w:val="left"/>
+      <w:pPr>
+        <w:ind w:left="720" w:hanging="360"/>
+      </w:pPr>
+      <w:rPr>
+        <w:rFonts w:ascii="Aptos" w:eastAsiaTheme="minorHAnsi" w:hAnsi="Aptos" w:cstheme="minorBidi" w:hint="default"/>
+      </w:rPr>
+    </w:lvl>
+    <w:lvl w:ilvl="1" w:tplc="04090003">
+      <w:start w:val="1"/>
+      <w:numFmt w:val="bullet"/>
+      <w:lvlText w:val="o"/>
+      <w:lvlJc w:val="left"/>
+      <w:pPr>
+        <w:ind w:left="1440" w:hanging="360"/>
+      </w:pPr>
+      <w:rPr>
+        <w:rFonts w:ascii="Courier New" w:hAnsi="Courier New" w:cs="Courier New" w:hint="default"/>
+      </w:rPr>
+    </w:lvl>
+    <w:lvl w:ilvl="2" w:tplc="04090005" w:tentative="1">
+      <w:start w:val="1"/>
+      <w:numFmt w:val="bullet"/>
+      <w:lvlText w:val=""/>
+      <w:lvlJc w:val="left"/>
+      <w:pPr>
+        <w:ind w:left="2160" w:hanging="360"/>
+      </w:pPr>
+      <w:rPr>
+        <w:rFonts w:ascii="Wingdings" w:hAnsi="Wingdings" w:hint="default"/>
+      </w:rPr>
+    </w:lvl>
+    <w:lvl w:ilvl="3" w:tplc="04090001" w:tentative="1">
+      <w:start w:val="1"/>
+      <w:numFmt w:val="bullet"/>
+      <w:lvlText w:val=""/>
+      <w:lvlJc w:val="left"/>
+      <w:pPr>
+        <w:ind w:left="2880" w:hanging="360"/>
+      </w:pPr>
+      <w:rPr>
+        <w:rFonts w:ascii="Symbol" w:hAnsi="Symbol" w:hint="default"/>
+      </w:rPr>
+    </w:lvl>
+    <w:lvl w:ilvl="4" w:tplc="04090003" w:tentative="1">
+      <w:start w:val="1"/>
+      <w:numFmt w:val="bullet"/>
+      <w:lvlText w:val="o"/>
+      <w:lvlJc w:val="left"/>
+      <w:pPr>
+        <w:ind w:left="3600" w:hanging="360"/>
+      </w:pPr>
+      <w:rPr>
+        <w:rFonts w:ascii="Courier New" w:hAnsi="Courier New" w:cs="Courier New" w:hint="default"/>
+      </w:rPr>
+    </w:lvl>
+    <w:lvl w:ilvl="5" w:tplc="04090005" w:tentative="1">
+      <w:start w:val="1"/>
+      <w:numFmt w:val="bullet"/>
+      <w:lvlText w:val=""/>
+      <w:lvlJc w:val="left"/>
+      <w:pPr>
+        <w:ind w:left="4320" w:hanging="360"/>
+      </w:pPr>
+      <w:rPr>
+        <w:rFonts w:ascii="Wingdings" w:hAnsi="Wingdings" w:hint="default"/>
+      </w:rPr>
+    </w:lvl>
+    <w:lvl w:ilvl="6" w:tplc="04090001" w:tentative="1">
+      <w:start w:val="1"/>
+      <w:numFmt w:val="bullet"/>
+      <w:lvlText w:val=""/>
+      <w:lvlJc w:val="left"/>
+      <w:pPr>
+        <w:ind w:left="5040" w:hanging="360"/>
+      </w:pPr>
+      <w:rPr>
+        <w:rFonts w:ascii="Symbol" w:hAnsi="Symbol" w:hint="default"/>
+      </w:rPr>
+    </w:lvl>
+    <w:lvl w:ilvl="7" w:tplc="04090003" w:tentative="1">
+      <w:start w:val="1"/>
+      <w:numFmt w:val="bullet"/>
+      <w:lvlText w:val="o"/>
+      <w:lvlJc w:val="left"/>
+      <w:pPr>
+        <w:ind w:left="5760" w:hanging="360"/>
+      </w:pPr>
+      <w:rPr>
+        <w:rFonts w:ascii="Courier New" w:hAnsi="Courier New" w:cs="Courier New" w:hint="default"/>
+      </w:rPr>
+    </w:lvl>
+    <w:lvl w:ilvl="8" w:tplc="04090005" w:tentative="1">
+      <w:start w:val="1"/>
+      <w:numFmt w:val="bullet"/>
+      <w:lvlText w:val=""/>
+      <w:lvlJc w:val="left"/>
+      <w:pPr>
+        <w:ind w:left="6480" w:hanging="360"/>
+      </w:pPr>
+      <w:rPr>
+        <w:rFonts w:ascii="Wingdings" w:hAnsi="Wingdings" w:hint="default"/>
+      </w:rPr>
+    </w:lvl>
+  </w:abstractNum>
+  <w:abstractNum w:abstractNumId="3" w15:restartNumberingAfterBreak="0">
     <w:nsid w:val="4EE326C6"/>
     <w:multiLevelType w:val="multilevel"/>
     <w:tmpl w:val="51BCF8FC"/>
@@ -2326,7 +2172,7 @@
       </w:rPr>
     </w:lvl>
   </w:abstractNum>
-  <w:abstractNum w:abstractNumId="3" w15:restartNumberingAfterBreak="0">
+  <w:abstractNum w:abstractNumId="4" w15:restartNumberingAfterBreak="0">
     <w:nsid w:val="6AD07904"/>
     <w:multiLevelType w:val="multilevel"/>
     <w:tmpl w:val="C74C498C"/>
@@ -2475,7 +2321,7 @@
       </w:rPr>
     </w:lvl>
   </w:abstractNum>
-  <w:abstractNum w:abstractNumId="4" w15:restartNumberingAfterBreak="0">
+  <w:abstractNum w:abstractNumId="5" w15:restartNumberingAfterBreak="0">
     <w:nsid w:val="6B04363F"/>
     <w:multiLevelType w:val="hybridMultilevel"/>
     <w:tmpl w:val="C4E068C6"/>
@@ -2591,16 +2437,19 @@
     <w:abstractNumId w:val="1"/>
   </w:num>
   <w:num w:numId="2" w16cid:durableId="1216816174">
+    <w:abstractNumId w:val="5"/>
+  </w:num>
+  <w:num w:numId="3" w16cid:durableId="2108454373">
     <w:abstractNumId w:val="4"/>
   </w:num>
-  <w:num w:numId="3" w16cid:durableId="2108454373">
+  <w:num w:numId="4" w16cid:durableId="1039433681">
     <w:abstractNumId w:val="3"/>
-  </w:num>
-  <w:num w:numId="4" w16cid:durableId="1039433681">
-    <w:abstractNumId w:val="2"/>
   </w:num>
   <w:num w:numId="5" w16cid:durableId="1487548499">
     <w:abstractNumId w:val="0"/>
+  </w:num>
+  <w:num w:numId="6" w16cid:durableId="1295871527">
+    <w:abstractNumId w:val="2"/>
   </w:num>
 </w:numbering>
 </file>

</xml_diff>